<commit_message>
fix(bao-cao-thuc-tap): convert Appendix A diary to table format
- Replace narrative format (weekly subsections with bullets) with structured table
- Table structure: 4 columns (Tuần, Thời gian, Nội dung công việc, Kỹ năng & Kết quả)
- 14 rows total (1 header + 13 data rows for 13 weeks)
- Add missing imports: parse_xml, nsdecls, WD_ALIGN_VERTICAL
- Format: gray header background, centered/justified alignment, Times New Roman 12pt
</commit_message>
<xml_diff>
--- a/documents/02-academic/word-reports/bao-cao-thuc-tap/BAO_CAO_THUC_TAP.docx
+++ b/documents/02-academic/word-reports/bao-cao-thuc-tap/BAO_CAO_THUC_TAP.docx
@@ -8810,2728 +8810,1115 @@
         <w:t>Thời gian thực tập: Từ ngày 01/12/2025 đến ngày 01/03/2026</w:t>
       </w:r>
     </w:p>
-    <w:p>
-      <w:pPr>
-        <w:spacing w:line="288" w:lineRule="auto"/>
-        <w:jc w:val="both"/>
-      </w:pPr>
-      <w:r>
-        <w:rPr>
-          <w:rFonts w:ascii="Times New Roman" w:hAnsi="Times New Roman" w:eastAsia="Times New Roman"/>
-          <w:b w:val="0"/>
-          <w:i w:val="0"/>
-          <w:sz w:val="26"/>
-        </w:rPr>
-        <w:t>Dưới đây là nhật ký chi tiết theo từng tuần trong quá trình thực tập tại dự án SORA STEP4:</w:t>
-      </w:r>
-    </w:p>
-    <w:p>
-      <w:pPr>
-        <w:pStyle w:val="Heading3"/>
-      </w:pPr>
-      <w:r>
-        <w:rPr>
-          <w:rFonts w:ascii="Times New Roman" w:hAnsi="Times New Roman" w:eastAsia="Times New Roman"/>
-          <w:b/>
-          <w:i w:val="0"/>
-          <w:color w:val="000000"/>
-          <w:sz w:val="28"/>
-        </w:rPr>
-        <w:t>Tuần 1: 01/12/2025 - 07/12/2025</w:t>
-      </w:r>
-    </w:p>
-    <w:p>
-      <w:pPr>
-        <w:spacing w:line="288" w:lineRule="auto"/>
-        <w:ind w:firstLine="567"/>
-        <w:jc w:val="both"/>
-      </w:pPr>
-      <w:r>
-        <w:rPr>
-          <w:rFonts w:ascii="Times New Roman" w:hAnsi="Times New Roman" w:eastAsia="Times New Roman"/>
-          <w:b w:val="0"/>
-          <w:i w:val="0"/>
-          <w:sz w:val="26"/>
-        </w:rPr>
-        <w:t>Công việc thực hiện:</w:t>
-      </w:r>
-    </w:p>
-    <w:p>
-      <w:pPr>
-        <w:pStyle w:val="ListBullet"/>
-        <w:spacing w:line="288" w:lineRule="auto"/>
-        <w:ind w:left="850" w:hanging="283"/>
-      </w:pPr>
-      <w:r>
-        <w:rPr>
-          <w:rFonts w:ascii="Times New Roman" w:hAnsi="Times New Roman" w:eastAsia="Times New Roman"/>
-          <w:b w:val="0"/>
-          <w:i w:val="0"/>
-          <w:sz w:val="26"/>
-        </w:rPr>
-        <w:t>Tham gia buổi onboarding và làm quen với môi trường công ty</w:t>
-      </w:r>
-    </w:p>
-    <w:p>
-      <w:pPr>
-        <w:pStyle w:val="ListBullet"/>
-        <w:spacing w:line="288" w:lineRule="auto"/>
-        <w:ind w:left="850" w:hanging="283"/>
-      </w:pPr>
-      <w:r>
-        <w:rPr>
-          <w:rFonts w:ascii="Times New Roman" w:hAnsi="Times New Roman" w:eastAsia="Times New Roman"/>
-          <w:b w:val="0"/>
-          <w:i w:val="0"/>
-          <w:sz w:val="26"/>
-        </w:rPr>
-        <w:t>Tìm hiểu về dự án SORA STEP4: mục tiêu, phạm vi, kiến trúc hệ thống</w:t>
-      </w:r>
-    </w:p>
-    <w:p>
-      <w:pPr>
-        <w:pStyle w:val="ListBullet"/>
-        <w:spacing w:line="288" w:lineRule="auto"/>
-        <w:ind w:left="850" w:hanging="283"/>
-      </w:pPr>
-      <w:r>
-        <w:rPr>
-          <w:rFonts w:ascii="Times New Roman" w:hAnsi="Times New Roman" w:eastAsia="Times New Roman"/>
-          <w:b w:val="0"/>
-          <w:i w:val="0"/>
-          <w:sz w:val="26"/>
-        </w:rPr>
-        <w:t>Được giới thiệu về quy trình làm việc và công cụ sử dụng (Git, IntelliJ IDEA, Oracle SQL Developer)</w:t>
-      </w:r>
-    </w:p>
-    <w:p>
-      <w:pPr>
-        <w:pStyle w:val="ListBullet"/>
-        <w:spacing w:line="288" w:lineRule="auto"/>
-        <w:ind w:left="850" w:hanging="283"/>
-      </w:pPr>
-      <w:r>
-        <w:rPr>
-          <w:rFonts w:ascii="Times New Roman" w:hAnsi="Times New Roman" w:eastAsia="Times New Roman"/>
-          <w:b w:val="0"/>
-          <w:i w:val="0"/>
-          <w:sz w:val="26"/>
-        </w:rPr>
-        <w:t>Ôn tập kiến thức về Java, Spring Boot, Oracle Database</w:t>
-      </w:r>
-    </w:p>
-    <w:p>
-      <w:pPr>
-        <w:pStyle w:val="ListBullet"/>
-        <w:spacing w:line="288" w:lineRule="auto"/>
-        <w:ind w:left="850" w:hanging="283"/>
-      </w:pPr>
-      <w:r>
-        <w:rPr>
-          <w:rFonts w:ascii="Times New Roman" w:hAnsi="Times New Roman" w:eastAsia="Times New Roman"/>
-          <w:b w:val="0"/>
-          <w:i w:val="0"/>
-          <w:sz w:val="26"/>
-        </w:rPr>
-        <w:t>Đọc tài liệu yêu cầu nghiệp vụ (Business Requirement Document)</w:t>
-      </w:r>
-    </w:p>
-    <w:p>
-      <w:pPr>
-        <w:spacing w:line="288" w:lineRule="auto"/>
-        <w:ind w:firstLine="567"/>
-        <w:jc w:val="both"/>
-      </w:pPr>
-      <w:r>
-        <w:rPr>
-          <w:rFonts w:ascii="Times New Roman" w:hAnsi="Times New Roman" w:eastAsia="Times New Roman"/>
-          <w:b w:val="0"/>
-          <w:i w:val="0"/>
-          <w:sz w:val="26"/>
-        </w:rPr>
-        <w:t>Kỹ năng học được:</w:t>
-      </w:r>
-    </w:p>
-    <w:p>
-      <w:pPr>
-        <w:pStyle w:val="ListBullet"/>
-        <w:spacing w:line="288" w:lineRule="auto"/>
-        <w:ind w:left="850" w:hanging="283"/>
-      </w:pPr>
-      <w:r>
-        <w:rPr>
-          <w:rFonts w:ascii="Times New Roman" w:hAnsi="Times New Roman" w:eastAsia="Times New Roman"/>
-          <w:b w:val="0"/>
-          <w:i w:val="0"/>
-          <w:sz w:val="26"/>
-        </w:rPr>
-        <w:t>Hiểu về quy trình phát triển phần mềm offshore theo tiêu chuẩn Nhật Bản</w:t>
-      </w:r>
-    </w:p>
-    <w:p>
-      <w:pPr>
-        <w:pStyle w:val="ListBullet"/>
-        <w:spacing w:line="288" w:lineRule="auto"/>
-        <w:ind w:left="850" w:hanging="283"/>
-      </w:pPr>
-      <w:r>
-        <w:rPr>
-          <w:rFonts w:ascii="Times New Roman" w:hAnsi="Times New Roman" w:eastAsia="Times New Roman"/>
-          <w:b w:val="0"/>
-          <w:i w:val="0"/>
-          <w:sz w:val="26"/>
-        </w:rPr>
-        <w:t>Nắm được cấu trúc tổ chức dự án và vai trò của từng thành viên</w:t>
-      </w:r>
-    </w:p>
-    <w:p>
-      <w:pPr>
-        <w:pStyle w:val="ListBullet"/>
-        <w:spacing w:line="288" w:lineRule="auto"/>
-        <w:ind w:left="850" w:hanging="283"/>
-      </w:pPr>
-      <w:r>
-        <w:rPr>
-          <w:rFonts w:ascii="Times New Roman" w:hAnsi="Times New Roman" w:eastAsia="Times New Roman"/>
-          <w:b w:val="0"/>
-          <w:i w:val="0"/>
-          <w:sz w:val="26"/>
-        </w:rPr>
-        <w:t>Làm quen với công cụ quản lý dự án và communication tools</w:t>
-      </w:r>
-    </w:p>
-    <w:p>
-      <w:pPr>
-        <w:spacing w:line="288" w:lineRule="auto"/>
-        <w:ind w:firstLine="567"/>
-        <w:jc w:val="both"/>
-      </w:pPr>
-      <w:r>
-        <w:rPr>
-          <w:rFonts w:ascii="Times New Roman" w:hAnsi="Times New Roman" w:eastAsia="Times New Roman"/>
-          <w:b w:val="0"/>
-          <w:i w:val="0"/>
-          <w:sz w:val="26"/>
-        </w:rPr>
-        <w:t>Thách thức: Ban đầu gặp khó khăn trong việc hiểu thuật ngữ chuyên ngành và các tài liệu kỹ thuật bằng tiếng Anh/tiếng Nhật.</w:t>
-      </w:r>
-    </w:p>
-    <w:p>
-      <w:pPr>
-        <w:spacing w:line="288" w:lineRule="auto"/>
-        <w:ind w:firstLine="567"/>
-        <w:jc w:val="both"/>
-      </w:pPr>
-      <w:r>
-        <w:rPr>
-          <w:rFonts w:ascii="Times New Roman" w:hAnsi="Times New Roman" w:eastAsia="Times New Roman"/>
-          <w:b w:val="0"/>
-          <w:i w:val="0"/>
-          <w:sz w:val="26"/>
-        </w:rPr>
-        <w:t>Kết quả: Hoàn thành onboarding, nắm được overview về dự án và sẵn sàng bắt đầu công việc chuyên môn.</w:t>
-      </w:r>
-    </w:p>
-    <w:p>
-      <w:pPr>
-        <w:pStyle w:val="Heading3"/>
-      </w:pPr>
-      <w:r>
-        <w:rPr>
-          <w:rFonts w:ascii="Times New Roman" w:hAnsi="Times New Roman" w:eastAsia="Times New Roman"/>
-          <w:b/>
-          <w:i w:val="0"/>
-          <w:color w:val="000000"/>
-          <w:sz w:val="28"/>
-        </w:rPr>
-        <w:t>Tuần 2: 08/12/2025 - 14/12/2025</w:t>
-      </w:r>
-    </w:p>
-    <w:p>
-      <w:pPr>
-        <w:spacing w:line="288" w:lineRule="auto"/>
-        <w:ind w:firstLine="567"/>
-        <w:jc w:val="both"/>
-      </w:pPr>
-      <w:r>
-        <w:rPr>
-          <w:rFonts w:ascii="Times New Roman" w:hAnsi="Times New Roman" w:eastAsia="Times New Roman"/>
-          <w:b w:val="0"/>
-          <w:i w:val="0"/>
-          <w:sz w:val="26"/>
-        </w:rPr>
-        <w:t>Công việc thực hiện:</w:t>
-      </w:r>
-    </w:p>
-    <w:p>
-      <w:pPr>
-        <w:pStyle w:val="ListBullet"/>
-        <w:spacing w:line="288" w:lineRule="auto"/>
-        <w:ind w:left="850" w:hanging="283"/>
-      </w:pPr>
-      <w:r>
-        <w:rPr>
-          <w:rFonts w:ascii="Times New Roman" w:hAnsi="Times New Roman" w:eastAsia="Times New Roman"/>
-          <w:b w:val="0"/>
-          <w:i w:val="0"/>
-          <w:sz w:val="26"/>
-        </w:rPr>
-        <w:t>Tham gia khóa training về thiết kế cơ sở dữ liệu (Database Design)</w:t>
-      </w:r>
-    </w:p>
-    <w:p>
-      <w:pPr>
-        <w:pStyle w:val="ListBullet"/>
-        <w:spacing w:line="288" w:lineRule="auto"/>
-        <w:ind w:left="850" w:hanging="283"/>
-      </w:pPr>
-      <w:r>
-        <w:rPr>
-          <w:rFonts w:ascii="Times New Roman" w:hAnsi="Times New Roman" w:eastAsia="Times New Roman"/>
-          <w:b w:val="0"/>
-          <w:i w:val="0"/>
-          <w:sz w:val="26"/>
-        </w:rPr>
-        <w:t>Học về Oracle Database: data types, constraints, indexes</w:t>
-      </w:r>
-    </w:p>
-    <w:p>
-      <w:pPr>
-        <w:pStyle w:val="ListBullet"/>
-        <w:spacing w:line="288" w:lineRule="auto"/>
-        <w:ind w:left="850" w:hanging="283"/>
-      </w:pPr>
-      <w:r>
-        <w:rPr>
-          <w:rFonts w:ascii="Times New Roman" w:hAnsi="Times New Roman" w:eastAsia="Times New Roman"/>
-          <w:b w:val="0"/>
-          <w:i w:val="0"/>
-          <w:sz w:val="26"/>
-        </w:rPr>
-        <w:t>Tìm hiểu naming convention chuẩn cho table, column, index theo quy định của dự án</w:t>
-      </w:r>
-    </w:p>
-    <w:p>
-      <w:pPr>
-        <w:pStyle w:val="ListBullet"/>
-        <w:spacing w:line="288" w:lineRule="auto"/>
-        <w:ind w:left="850" w:hanging="283"/>
-      </w:pPr>
-      <w:r>
-        <w:rPr>
-          <w:rFonts w:ascii="Times New Roman" w:hAnsi="Times New Roman" w:eastAsia="Times New Roman"/>
-          <w:b w:val="0"/>
-          <w:i w:val="0"/>
-          <w:sz w:val="26"/>
-        </w:rPr>
-        <w:t>Nghiên cứu cấu trúc database hiện có của hệ thống SORA</w:t>
-      </w:r>
-    </w:p>
-    <w:p>
-      <w:pPr>
-        <w:pStyle w:val="ListBullet"/>
-        <w:spacing w:line="288" w:lineRule="auto"/>
-        <w:ind w:left="850" w:hanging="283"/>
-      </w:pPr>
-      <w:r>
-        <w:rPr>
-          <w:rFonts w:ascii="Times New Roman" w:hAnsi="Times New Roman" w:eastAsia="Times New Roman"/>
-          <w:b w:val="0"/>
-          <w:i w:val="0"/>
-          <w:sz w:val="26"/>
-        </w:rPr>
-        <w:t>Thực hành đọc và phân tích Entity Relationship Diagram (ERD)</w:t>
-      </w:r>
-    </w:p>
-    <w:p>
-      <w:pPr>
-        <w:spacing w:line="288" w:lineRule="auto"/>
-        <w:ind w:firstLine="567"/>
-        <w:jc w:val="both"/>
-      </w:pPr>
-      <w:r>
-        <w:rPr>
-          <w:rFonts w:ascii="Times New Roman" w:hAnsi="Times New Roman" w:eastAsia="Times New Roman"/>
-          <w:b w:val="0"/>
-          <w:i w:val="0"/>
-          <w:sz w:val="26"/>
-        </w:rPr>
-        <w:t>Kỹ năng học được:</w:t>
-      </w:r>
-    </w:p>
-    <w:p>
-      <w:pPr>
-        <w:pStyle w:val="ListBullet"/>
-        <w:spacing w:line="288" w:lineRule="auto"/>
-        <w:ind w:left="850" w:hanging="283"/>
-      </w:pPr>
-      <w:r>
-        <w:rPr>
-          <w:rFonts w:ascii="Times New Roman" w:hAnsi="Times New Roman" w:eastAsia="Times New Roman"/>
-          <w:b w:val="0"/>
-          <w:i w:val="0"/>
-          <w:sz w:val="26"/>
-        </w:rPr>
-        <w:t>Nắm vững các kiểu dữ liệu Oracle: VARCHAR2, NUMBER, DATE, CLOB, BLOB</w:t>
-      </w:r>
-    </w:p>
-    <w:p>
-      <w:pPr>
-        <w:pStyle w:val="ListBullet"/>
-        <w:spacing w:line="288" w:lineRule="auto"/>
-        <w:ind w:left="850" w:hanging="283"/>
-      </w:pPr>
-      <w:r>
-        <w:rPr>
-          <w:rFonts w:ascii="Times New Roman" w:hAnsi="Times New Roman" w:eastAsia="Times New Roman"/>
-          <w:b w:val="0"/>
-          <w:i w:val="0"/>
-          <w:sz w:val="26"/>
-        </w:rPr>
-        <w:t>Hiểu về constraints: PRIMARY KEY, FOREIGN KEY, NOT NULL, UNIQUE, CHECK</w:t>
-      </w:r>
-    </w:p>
-    <w:p>
-      <w:pPr>
-        <w:pStyle w:val="ListBullet"/>
-        <w:spacing w:line="288" w:lineRule="auto"/>
-        <w:ind w:left="850" w:hanging="283"/>
-      </w:pPr>
-      <w:r>
-        <w:rPr>
-          <w:rFonts w:ascii="Times New Roman" w:hAnsi="Times New Roman" w:eastAsia="Times New Roman"/>
-          <w:b w:val="0"/>
-          <w:i w:val="0"/>
-          <w:sz w:val="26"/>
-        </w:rPr>
-        <w:t>Biết cách tạo và tối ưu indexes (B-tree, Bitmap, Function-based)</w:t>
-      </w:r>
-    </w:p>
-    <w:p>
-      <w:pPr>
-        <w:spacing w:line="288" w:lineRule="auto"/>
-        <w:ind w:firstLine="567"/>
-        <w:jc w:val="both"/>
-      </w:pPr>
-      <w:r>
-        <w:rPr>
-          <w:rFonts w:ascii="Times New Roman" w:hAnsi="Times New Roman" w:eastAsia="Times New Roman"/>
-          <w:b w:val="0"/>
-          <w:i w:val="0"/>
-          <w:sz w:val="26"/>
-        </w:rPr>
-        <w:t>Thách thức: Oracle Database có nhiều khác biệt so với MySQL/PostgreSQL đã học ở trường, cần thời gian để làm quen với syntax và best practices.</w:t>
-      </w:r>
-    </w:p>
-    <w:p>
-      <w:pPr>
-        <w:spacing w:line="288" w:lineRule="auto"/>
-        <w:ind w:firstLine="567"/>
-        <w:jc w:val="both"/>
-      </w:pPr>
-      <w:r>
-        <w:rPr>
-          <w:rFonts w:ascii="Times New Roman" w:hAnsi="Times New Roman" w:eastAsia="Times New Roman"/>
-          <w:b w:val="0"/>
-          <w:i w:val="0"/>
-          <w:sz w:val="26"/>
-        </w:rPr>
-        <w:t>Kết quả: Hoàn thành training DB Design, có thể đọc hiểu ERD và database schema của hệ thống hiện tại.</w:t>
-      </w:r>
-    </w:p>
-    <w:p>
-      <w:pPr>
-        <w:pStyle w:val="Heading3"/>
-      </w:pPr>
-      <w:r>
-        <w:rPr>
-          <w:rFonts w:ascii="Times New Roman" w:hAnsi="Times New Roman" w:eastAsia="Times New Roman"/>
-          <w:b/>
-          <w:i w:val="0"/>
-          <w:color w:val="000000"/>
-          <w:sz w:val="28"/>
-        </w:rPr>
-        <w:t>Tuần 3: 15/12/2025 - 21/12/2025</w:t>
-      </w:r>
-    </w:p>
-    <w:p>
-      <w:pPr>
-        <w:spacing w:line="288" w:lineRule="auto"/>
-        <w:ind w:firstLine="567"/>
-        <w:jc w:val="both"/>
-      </w:pPr>
-      <w:r>
-        <w:rPr>
-          <w:rFonts w:ascii="Times New Roman" w:hAnsi="Times New Roman" w:eastAsia="Times New Roman"/>
-          <w:b w:val="0"/>
-          <w:i w:val="0"/>
-          <w:sz w:val="26"/>
-        </w:rPr>
-        <w:t>Công việc thực hiện:</w:t>
-      </w:r>
-    </w:p>
-    <w:p>
-      <w:pPr>
-        <w:pStyle w:val="ListBullet"/>
-        <w:spacing w:line="288" w:lineRule="auto"/>
-        <w:ind w:left="850" w:hanging="283"/>
-      </w:pPr>
-      <w:r>
-        <w:rPr>
-          <w:rFonts w:ascii="Times New Roman" w:hAnsi="Times New Roman" w:eastAsia="Times New Roman"/>
-          <w:b w:val="0"/>
-          <w:i w:val="0"/>
-          <w:sz w:val="26"/>
-        </w:rPr>
-        <w:t>Thực hành thiết kế bảng (table) cho module User Management</w:t>
-      </w:r>
-    </w:p>
-    <w:p>
-      <w:pPr>
-        <w:pStyle w:val="ListBullet"/>
-        <w:spacing w:line="288" w:lineRule="auto"/>
-        <w:ind w:left="850" w:hanging="283"/>
-      </w:pPr>
-      <w:r>
-        <w:rPr>
-          <w:rFonts w:ascii="Times New Roman" w:hAnsi="Times New Roman" w:eastAsia="Times New Roman"/>
-          <w:b w:val="0"/>
-          <w:i w:val="0"/>
-          <w:sz w:val="26"/>
-        </w:rPr>
-        <w:t>Định nghĩa các cột với kiểu dữ liệu, độ dài, constraints phù hợp</w:t>
-      </w:r>
-    </w:p>
-    <w:p>
-      <w:pPr>
-        <w:pStyle w:val="ListBullet"/>
-        <w:spacing w:line="288" w:lineRule="auto"/>
-        <w:ind w:left="850" w:hanging="283"/>
-      </w:pPr>
-      <w:r>
-        <w:rPr>
-          <w:rFonts w:ascii="Times New Roman" w:hAnsi="Times New Roman" w:eastAsia="Times New Roman"/>
-          <w:b w:val="0"/>
-          <w:i w:val="0"/>
-          <w:sz w:val="26"/>
-        </w:rPr>
-        <w:t>Tạo Entity Info document: tên logic, tên vật lý, mô tả entity</w:t>
-      </w:r>
-    </w:p>
-    <w:p>
-      <w:pPr>
-        <w:pStyle w:val="ListBullet"/>
-        <w:spacing w:line="288" w:lineRule="auto"/>
-        <w:ind w:left="850" w:hanging="283"/>
-      </w:pPr>
-      <w:r>
-        <w:rPr>
-          <w:rFonts w:ascii="Times New Roman" w:hAnsi="Times New Roman" w:eastAsia="Times New Roman"/>
-          <w:b w:val="0"/>
-          <w:i w:val="0"/>
-          <w:sz w:val="26"/>
-        </w:rPr>
-        <w:t>Tạo Column Info document: chi tiết từng column với data type, length, nullable, default value</w:t>
-      </w:r>
-    </w:p>
-    <w:p>
-      <w:pPr>
-        <w:pStyle w:val="ListBullet"/>
-        <w:spacing w:line="288" w:lineRule="auto"/>
-        <w:ind w:left="850" w:hanging="283"/>
-      </w:pPr>
-      <w:r>
-        <w:rPr>
-          <w:rFonts w:ascii="Times New Roman" w:hAnsi="Times New Roman" w:eastAsia="Times New Roman"/>
-          <w:b w:val="0"/>
-          <w:i w:val="0"/>
-          <w:sz w:val="26"/>
-        </w:rPr>
-        <w:t>Review thiết kế với mentor và xử lý feedback đợt 1</w:t>
-      </w:r>
-    </w:p>
-    <w:p>
-      <w:pPr>
-        <w:spacing w:line="288" w:lineRule="auto"/>
-        <w:ind w:firstLine="567"/>
-        <w:jc w:val="both"/>
-      </w:pPr>
-      <w:r>
-        <w:rPr>
-          <w:rFonts w:ascii="Times New Roman" w:hAnsi="Times New Roman" w:eastAsia="Times New Roman"/>
-          <w:b w:val="0"/>
-          <w:i w:val="0"/>
-          <w:sz w:val="26"/>
-        </w:rPr>
-        <w:t>Kỹ năng học được:</w:t>
-      </w:r>
-    </w:p>
-    <w:p>
-      <w:pPr>
-        <w:pStyle w:val="ListBullet"/>
-        <w:spacing w:line="288" w:lineRule="auto"/>
-        <w:ind w:left="850" w:hanging="283"/>
-      </w:pPr>
-      <w:r>
-        <w:rPr>
-          <w:rFonts w:ascii="Times New Roman" w:hAnsi="Times New Roman" w:eastAsia="Times New Roman"/>
-          <w:b w:val="0"/>
-          <w:i w:val="0"/>
-          <w:sz w:val="26"/>
-        </w:rPr>
-        <w:t>Kỹ năng phân tích yêu cầu nghiệp vụ để xác định entities và relationships</w:t>
-      </w:r>
-    </w:p>
-    <w:p>
-      <w:pPr>
-        <w:pStyle w:val="ListBullet"/>
-        <w:spacing w:line="288" w:lineRule="auto"/>
-        <w:ind w:left="850" w:hanging="283"/>
-      </w:pPr>
-      <w:r>
-        <w:rPr>
-          <w:rFonts w:ascii="Times New Roman" w:hAnsi="Times New Roman" w:eastAsia="Times New Roman"/>
-          <w:b w:val="0"/>
-          <w:i w:val="0"/>
-          <w:sz w:val="26"/>
-        </w:rPr>
-        <w:t>Áp dụng normalization (1NF, 2NF, 3NF) để tránh data redundancy</w:t>
-      </w:r>
-    </w:p>
-    <w:p>
-      <w:pPr>
-        <w:pStyle w:val="ListBullet"/>
-        <w:spacing w:line="288" w:lineRule="auto"/>
-        <w:ind w:left="850" w:hanging="283"/>
-      </w:pPr>
-      <w:r>
-        <w:rPr>
-          <w:rFonts w:ascii="Times New Roman" w:hAnsi="Times New Roman" w:eastAsia="Times New Roman"/>
-          <w:b w:val="0"/>
-          <w:i w:val="0"/>
-          <w:sz w:val="26"/>
-        </w:rPr>
-        <w:t>Viết tài liệu thiết kế database theo template chuẩn của dự án</w:t>
-      </w:r>
-    </w:p>
-    <w:p>
-      <w:pPr>
-        <w:spacing w:line="288" w:lineRule="auto"/>
-        <w:ind w:firstLine="567"/>
-        <w:jc w:val="both"/>
-      </w:pPr>
-      <w:r>
-        <w:rPr>
-          <w:rFonts w:ascii="Times New Roman" w:hAnsi="Times New Roman" w:eastAsia="Times New Roman"/>
-          <w:b w:val="0"/>
-          <w:i w:val="0"/>
-          <w:sz w:val="26"/>
-        </w:rPr>
-        <w:t>Thách thức: Gặp khó khăn trong việc xác định kiểu dữ liệu và độ dài phù hợp cho từng column, đặc biệt với VARCHAR2 và NUMBER.</w:t>
-      </w:r>
-    </w:p>
-    <w:p>
-      <w:pPr>
-        <w:spacing w:line="288" w:lineRule="auto"/>
-        <w:ind w:firstLine="567"/>
-        <w:jc w:val="both"/>
-      </w:pPr>
-      <w:r>
-        <w:rPr>
-          <w:rFonts w:ascii="Times New Roman" w:hAnsi="Times New Roman" w:eastAsia="Times New Roman"/>
-          <w:b w:val="0"/>
-          <w:i w:val="0"/>
-          <w:sz w:val="26"/>
-        </w:rPr>
-        <w:t>Kết quả: Hoàn thành thiết kế 5 bảng chính cho module User Management, pass review sau 1 lần sửa.</w:t>
-      </w:r>
-    </w:p>
-    <w:p>
-      <w:pPr>
-        <w:pStyle w:val="Heading3"/>
-      </w:pPr>
-      <w:r>
-        <w:rPr>
-          <w:rFonts w:ascii="Times New Roman" w:hAnsi="Times New Roman" w:eastAsia="Times New Roman"/>
-          <w:b/>
-          <w:i w:val="0"/>
-          <w:color w:val="000000"/>
-          <w:sz w:val="28"/>
-        </w:rPr>
-        <w:t>Tuần 4: 22/12/2025 - 28/12/2025</w:t>
-      </w:r>
-    </w:p>
-    <w:p>
-      <w:pPr>
-        <w:spacing w:line="288" w:lineRule="auto"/>
-        <w:ind w:firstLine="567"/>
-        <w:jc w:val="both"/>
-      </w:pPr>
-      <w:r>
-        <w:rPr>
-          <w:rFonts w:ascii="Times New Roman" w:hAnsi="Times New Roman" w:eastAsia="Times New Roman"/>
-          <w:b w:val="0"/>
-          <w:i w:val="0"/>
-          <w:sz w:val="26"/>
-        </w:rPr>
-        <w:t>Công việc thực hiện:</w:t>
-      </w:r>
-    </w:p>
-    <w:p>
-      <w:pPr>
-        <w:pStyle w:val="ListBullet"/>
-        <w:spacing w:line="288" w:lineRule="auto"/>
-        <w:ind w:left="850" w:hanging="283"/>
-      </w:pPr>
-      <w:r>
-        <w:rPr>
-          <w:rFonts w:ascii="Times New Roman" w:hAnsi="Times New Roman" w:eastAsia="Times New Roman"/>
-          <w:b w:val="0"/>
-          <w:i w:val="0"/>
-          <w:sz w:val="26"/>
-        </w:rPr>
-        <w:t>Tiếp tục thiết kế indexes cho các bảng đã tạo</w:t>
-      </w:r>
-    </w:p>
-    <w:p>
-      <w:pPr>
-        <w:pStyle w:val="ListBullet"/>
-        <w:spacing w:line="288" w:lineRule="auto"/>
-        <w:ind w:left="850" w:hanging="283"/>
-      </w:pPr>
-      <w:r>
-        <w:rPr>
-          <w:rFonts w:ascii="Times New Roman" w:hAnsi="Times New Roman" w:eastAsia="Times New Roman"/>
-          <w:b w:val="0"/>
-          <w:i w:val="0"/>
-          <w:sz w:val="26"/>
-        </w:rPr>
-        <w:t>Tạo Index Info document: loại index (PK, FK, Unique, Normal), columns, mục đích</w:t>
-      </w:r>
-    </w:p>
-    <w:p>
-      <w:pPr>
-        <w:pStyle w:val="ListBullet"/>
-        <w:spacing w:line="288" w:lineRule="auto"/>
-        <w:ind w:left="850" w:hanging="283"/>
-      </w:pPr>
-      <w:r>
-        <w:rPr>
-          <w:rFonts w:ascii="Times New Roman" w:hAnsi="Times New Roman" w:eastAsia="Times New Roman"/>
-          <w:b w:val="0"/>
-          <w:i w:val="0"/>
-          <w:sz w:val="26"/>
-        </w:rPr>
-        <w:t>Học về query optimization và explain plan trong Oracle</w:t>
-      </w:r>
-    </w:p>
-    <w:p>
-      <w:pPr>
-        <w:pStyle w:val="ListBullet"/>
-        <w:spacing w:line="288" w:lineRule="auto"/>
-        <w:ind w:left="850" w:hanging="283"/>
-      </w:pPr>
-      <w:r>
-        <w:rPr>
-          <w:rFonts w:ascii="Times New Roman" w:hAnsi="Times New Roman" w:eastAsia="Times New Roman"/>
-          <w:b w:val="0"/>
-          <w:i w:val="0"/>
-          <w:sz w:val="26"/>
-        </w:rPr>
-        <w:t>Bắt đầu training về thiết kế màn hình (Screen Design)</w:t>
-      </w:r>
-    </w:p>
-    <w:p>
-      <w:pPr>
-        <w:pStyle w:val="ListBullet"/>
-        <w:spacing w:line="288" w:lineRule="auto"/>
-        <w:ind w:left="850" w:hanging="283"/>
-      </w:pPr>
-      <w:r>
-        <w:rPr>
-          <w:rFonts w:ascii="Times New Roman" w:hAnsi="Times New Roman" w:eastAsia="Times New Roman"/>
-          <w:b w:val="0"/>
-          <w:i w:val="0"/>
-          <w:sz w:val="26"/>
-        </w:rPr>
-        <w:t>Tìm hiểu về wireframe và UI/UX principles</w:t>
-      </w:r>
-    </w:p>
-    <w:p>
-      <w:pPr>
-        <w:spacing w:line="288" w:lineRule="auto"/>
-        <w:ind w:firstLine="567"/>
-        <w:jc w:val="both"/>
-      </w:pPr>
-      <w:r>
-        <w:rPr>
-          <w:rFonts w:ascii="Times New Roman" w:hAnsi="Times New Roman" w:eastAsia="Times New Roman"/>
-          <w:b w:val="0"/>
-          <w:i w:val="0"/>
-          <w:sz w:val="26"/>
-        </w:rPr>
-        <w:t>Kỹ năng học được:</w:t>
-      </w:r>
-    </w:p>
-    <w:p>
-      <w:pPr>
-        <w:pStyle w:val="ListBullet"/>
-        <w:spacing w:line="288" w:lineRule="auto"/>
-        <w:ind w:left="850" w:hanging="283"/>
-      </w:pPr>
-      <w:r>
-        <w:rPr>
-          <w:rFonts w:ascii="Times New Roman" w:hAnsi="Times New Roman" w:eastAsia="Times New Roman"/>
-          <w:b w:val="0"/>
-          <w:i w:val="0"/>
-          <w:sz w:val="26"/>
-        </w:rPr>
-        <w:t>Hiểu khi nào nên tạo index và loại index phù hợp (B-tree vs Bitmap)</w:t>
-      </w:r>
-    </w:p>
-    <w:p>
-      <w:pPr>
-        <w:pStyle w:val="ListBullet"/>
-        <w:spacing w:line="288" w:lineRule="auto"/>
-        <w:ind w:left="850" w:hanging="283"/>
-      </w:pPr>
-      <w:r>
-        <w:rPr>
-          <w:rFonts w:ascii="Times New Roman" w:hAnsi="Times New Roman" w:eastAsia="Times New Roman"/>
-          <w:b w:val="0"/>
-          <w:i w:val="0"/>
-          <w:sz w:val="26"/>
-        </w:rPr>
-        <w:t>Biết cách analyze query performance với EXPLAIN PLAN</w:t>
-      </w:r>
-    </w:p>
-    <w:p>
-      <w:pPr>
-        <w:pStyle w:val="ListBullet"/>
-        <w:spacing w:line="288" w:lineRule="auto"/>
-        <w:ind w:left="850" w:hanging="283"/>
-      </w:pPr>
-      <w:r>
-        <w:rPr>
-          <w:rFonts w:ascii="Times New Roman" w:hAnsi="Times New Roman" w:eastAsia="Times New Roman"/>
-          <w:b w:val="0"/>
-          <w:i w:val="0"/>
-          <w:sz w:val="26"/>
-        </w:rPr>
-        <w:t>Nắm được quy trình thiết kế màn hình từ wireframe đến detailed design</w:t>
-      </w:r>
-    </w:p>
-    <w:p>
-      <w:pPr>
-        <w:spacing w:line="288" w:lineRule="auto"/>
-        <w:ind w:firstLine="567"/>
-        <w:jc w:val="both"/>
-      </w:pPr>
-      <w:r>
-        <w:rPr>
-          <w:rFonts w:ascii="Times New Roman" w:hAnsi="Times New Roman" w:eastAsia="Times New Roman"/>
-          <w:b w:val="0"/>
-          <w:i w:val="0"/>
-          <w:sz w:val="26"/>
-        </w:rPr>
-        <w:t>Thách thức: Việc quyết định tạo index cho column nào đòi hỏi hiểu sâu về business logic và query patterns.</w:t>
-      </w:r>
-    </w:p>
-    <w:p>
-      <w:pPr>
-        <w:spacing w:line="288" w:lineRule="auto"/>
-        <w:ind w:firstLine="567"/>
-        <w:jc w:val="both"/>
-      </w:pPr>
-      <w:r>
-        <w:rPr>
-          <w:rFonts w:ascii="Times New Roman" w:hAnsi="Times New Roman" w:eastAsia="Times New Roman"/>
-          <w:b w:val="0"/>
-          <w:i w:val="0"/>
-          <w:sz w:val="26"/>
-        </w:rPr>
-        <w:t>Kết quả: Hoàn thành Index Info cho tất cả các bảng, bắt đầu làm quen với Screen Design.</w:t>
-      </w:r>
-    </w:p>
-    <w:p>
-      <w:pPr>
-        <w:pStyle w:val="Heading3"/>
-      </w:pPr>
-      <w:r>
-        <w:rPr>
-          <w:rFonts w:ascii="Times New Roman" w:hAnsi="Times New Roman" w:eastAsia="Times New Roman"/>
-          <w:b/>
-          <w:i w:val="0"/>
-          <w:color w:val="000000"/>
-          <w:sz w:val="28"/>
-        </w:rPr>
-        <w:t>Tuần 5: 29/12/2025 - 04/01/2026</w:t>
-      </w:r>
-    </w:p>
-    <w:p>
-      <w:pPr>
-        <w:spacing w:line="288" w:lineRule="auto"/>
-        <w:ind w:firstLine="567"/>
-        <w:jc w:val="both"/>
-      </w:pPr>
-      <w:r>
-        <w:rPr>
-          <w:rFonts w:ascii="Times New Roman" w:hAnsi="Times New Roman" w:eastAsia="Times New Roman"/>
-          <w:b w:val="0"/>
-          <w:i w:val="0"/>
-          <w:sz w:val="26"/>
-        </w:rPr>
-        <w:t>Công việc thực hiện:</w:t>
-      </w:r>
-    </w:p>
-    <w:p>
-      <w:pPr>
-        <w:pStyle w:val="ListBullet"/>
-        <w:spacing w:line="288" w:lineRule="auto"/>
-        <w:ind w:left="850" w:hanging="283"/>
-      </w:pPr>
-      <w:r>
-        <w:rPr>
-          <w:rFonts w:ascii="Times New Roman" w:hAnsi="Times New Roman" w:eastAsia="Times New Roman"/>
-          <w:b w:val="0"/>
-          <w:i w:val="0"/>
-          <w:sz w:val="26"/>
-        </w:rPr>
-        <w:t>Thực hành thiết kế màn hình User List (danh sách người dùng)</w:t>
-      </w:r>
-    </w:p>
-    <w:p>
-      <w:pPr>
-        <w:pStyle w:val="ListBullet"/>
-        <w:spacing w:line="288" w:lineRule="auto"/>
-        <w:ind w:left="850" w:hanging="283"/>
-      </w:pPr>
-      <w:r>
-        <w:rPr>
-          <w:rFonts w:ascii="Times New Roman" w:hAnsi="Times New Roman" w:eastAsia="Times New Roman"/>
-          <w:b w:val="0"/>
-          <w:i w:val="0"/>
-          <w:sz w:val="26"/>
-        </w:rPr>
-        <w:t>Định nghĩa layout: header, search bar, data table, pagination, action buttons</w:t>
-      </w:r>
-    </w:p>
-    <w:p>
-      <w:pPr>
-        <w:pStyle w:val="ListBullet"/>
-        <w:spacing w:line="288" w:lineRule="auto"/>
-        <w:ind w:left="850" w:hanging="283"/>
-      </w:pPr>
-      <w:r>
-        <w:rPr>
-          <w:rFonts w:ascii="Times New Roman" w:hAnsi="Times New Roman" w:eastAsia="Times New Roman"/>
-          <w:b w:val="0"/>
-          <w:i w:val="0"/>
-          <w:sz w:val="26"/>
-        </w:rPr>
-        <w:t>Tạo Items document: ID, tên, loại (textbox/dropdown/button), I/O type, required flag</w:t>
-      </w:r>
-    </w:p>
-    <w:p>
-      <w:pPr>
-        <w:pStyle w:val="ListBullet"/>
-        <w:spacing w:line="288" w:lineRule="auto"/>
-        <w:ind w:left="850" w:hanging="283"/>
-      </w:pPr>
-      <w:r>
-        <w:rPr>
-          <w:rFonts w:ascii="Times New Roman" w:hAnsi="Times New Roman" w:eastAsia="Times New Roman"/>
-          <w:b w:val="0"/>
-          <w:i w:val="0"/>
-          <w:sz w:val="26"/>
-        </w:rPr>
-        <w:t>Định nghĩa validation rules: single validation (bắt buộc, độ dài, format)</w:t>
-      </w:r>
-    </w:p>
-    <w:p>
-      <w:pPr>
-        <w:pStyle w:val="ListBullet"/>
-        <w:spacing w:line="288" w:lineRule="auto"/>
-        <w:ind w:left="850" w:hanging="283"/>
-      </w:pPr>
-      <w:r>
-        <w:rPr>
-          <w:rFonts w:ascii="Times New Roman" w:hAnsi="Times New Roman" w:eastAsia="Times New Roman"/>
-          <w:b w:val="0"/>
-          <w:i w:val="0"/>
-          <w:sz w:val="26"/>
-        </w:rPr>
-        <w:t>Thiết kế messages: success, error, warning, info</w:t>
-      </w:r>
-    </w:p>
-    <w:p>
-      <w:pPr>
-        <w:spacing w:line="288" w:lineRule="auto"/>
-        <w:ind w:firstLine="567"/>
-        <w:jc w:val="both"/>
-      </w:pPr>
-      <w:r>
-        <w:rPr>
-          <w:rFonts w:ascii="Times New Roman" w:hAnsi="Times New Roman" w:eastAsia="Times New Roman"/>
-          <w:b w:val="0"/>
-          <w:i w:val="0"/>
-          <w:sz w:val="26"/>
-        </w:rPr>
-        <w:t>Kỹ năng học được:</w:t>
-      </w:r>
-    </w:p>
-    <w:p>
-      <w:pPr>
-        <w:pStyle w:val="ListBullet"/>
-        <w:spacing w:line="288" w:lineRule="auto"/>
-        <w:ind w:left="850" w:hanging="283"/>
-      </w:pPr>
-      <w:r>
-        <w:rPr>
-          <w:rFonts w:ascii="Times New Roman" w:hAnsi="Times New Roman" w:eastAsia="Times New Roman"/>
-          <w:b w:val="0"/>
-          <w:i w:val="0"/>
-          <w:sz w:val="26"/>
-        </w:rPr>
-        <w:t>Kỹ năng phân tích màn hình thành các components nhỏ</w:t>
-      </w:r>
-    </w:p>
-    <w:p>
-      <w:pPr>
-        <w:pStyle w:val="ListBullet"/>
-        <w:spacing w:line="288" w:lineRule="auto"/>
-        <w:ind w:left="850" w:hanging="283"/>
-      </w:pPr>
-      <w:r>
-        <w:rPr>
-          <w:rFonts w:ascii="Times New Roman" w:hAnsi="Times New Roman" w:eastAsia="Times New Roman"/>
-          <w:b w:val="0"/>
-          <w:i w:val="0"/>
-          <w:sz w:val="26"/>
-        </w:rPr>
-        <w:t>Hiểu về các loại validation: client-side vs server-side</w:t>
-      </w:r>
-    </w:p>
-    <w:p>
-      <w:pPr>
-        <w:pStyle w:val="ListBullet"/>
-        <w:spacing w:line="288" w:lineRule="auto"/>
-        <w:ind w:left="850" w:hanging="283"/>
-      </w:pPr>
-      <w:r>
-        <w:rPr>
-          <w:rFonts w:ascii="Times New Roman" w:hAnsi="Times New Roman" w:eastAsia="Times New Roman"/>
-          <w:b w:val="0"/>
-          <w:i w:val="0"/>
-          <w:sz w:val="26"/>
-        </w:rPr>
-        <w:t>Viết validation rules rõ ràng, đầy đủ trường hợp edge case</w:t>
-      </w:r>
-    </w:p>
-    <w:p>
-      <w:pPr>
-        <w:spacing w:line="288" w:lineRule="auto"/>
-        <w:ind w:firstLine="567"/>
-        <w:jc w:val="both"/>
-      </w:pPr>
-      <w:r>
-        <w:rPr>
-          <w:rFonts w:ascii="Times New Roman" w:hAnsi="Times New Roman" w:eastAsia="Times New Roman"/>
-          <w:b w:val="0"/>
-          <w:i w:val="0"/>
-          <w:sz w:val="26"/>
-        </w:rPr>
-        <w:t>Thách thức: Thiết kế màn hình phức tạp hơn DB design vì phải tham chiếu nhiều tài liệu (DB schema, API spec, business rules).</w:t>
-      </w:r>
-    </w:p>
-    <w:p>
-      <w:pPr>
-        <w:spacing w:line="288" w:lineRule="auto"/>
-        <w:ind w:firstLine="567"/>
-        <w:jc w:val="both"/>
-      </w:pPr>
-      <w:r>
-        <w:rPr>
-          <w:rFonts w:ascii="Times New Roman" w:hAnsi="Times New Roman" w:eastAsia="Times New Roman"/>
-          <w:b w:val="0"/>
-          <w:i w:val="0"/>
-          <w:sz w:val="26"/>
-        </w:rPr>
-        <w:t>Kết quả: Hoàn thành thiết kế màn hình User List với đầy đủ items, validation, messages.</w:t>
-      </w:r>
-    </w:p>
-    <w:p>
-      <w:pPr>
-        <w:pStyle w:val="Heading3"/>
-      </w:pPr>
-      <w:r>
-        <w:rPr>
-          <w:rFonts w:ascii="Times New Roman" w:hAnsi="Times New Roman" w:eastAsia="Times New Roman"/>
-          <w:b/>
-          <w:i w:val="0"/>
-          <w:color w:val="000000"/>
-          <w:sz w:val="28"/>
-        </w:rPr>
-        <w:t>Tuần 6: 05/01/2026 - 11/01/2026</w:t>
-      </w:r>
-    </w:p>
-    <w:p>
-      <w:pPr>
-        <w:spacing w:line="288" w:lineRule="auto"/>
-        <w:ind w:firstLine="567"/>
-        <w:jc w:val="both"/>
-      </w:pPr>
-      <w:r>
-        <w:rPr>
-          <w:rFonts w:ascii="Times New Roman" w:hAnsi="Times New Roman" w:eastAsia="Times New Roman"/>
-          <w:b w:val="0"/>
-          <w:i w:val="0"/>
-          <w:sz w:val="26"/>
-        </w:rPr>
-        <w:t>Công việc thực hiện:</w:t>
-      </w:r>
-    </w:p>
-    <w:p>
-      <w:pPr>
-        <w:pStyle w:val="ListBullet"/>
-        <w:spacing w:line="288" w:lineRule="auto"/>
-        <w:ind w:left="850" w:hanging="283"/>
-      </w:pPr>
-      <w:r>
-        <w:rPr>
-          <w:rFonts w:ascii="Times New Roman" w:hAnsi="Times New Roman" w:eastAsia="Times New Roman"/>
-          <w:b w:val="0"/>
-          <w:i w:val="0"/>
-          <w:sz w:val="26"/>
-        </w:rPr>
-        <w:t>Tiếp tục thiết kế màn hình User Detail (chi tiết/chỉnh sửa người dùng)</w:t>
-      </w:r>
-    </w:p>
-    <w:p>
-      <w:pPr>
-        <w:pStyle w:val="ListBullet"/>
-        <w:spacing w:line="288" w:lineRule="auto"/>
-        <w:ind w:left="850" w:hanging="283"/>
-      </w:pPr>
-      <w:r>
-        <w:rPr>
-          <w:rFonts w:ascii="Times New Roman" w:hAnsi="Times New Roman" w:eastAsia="Times New Roman"/>
-          <w:b w:val="0"/>
-          <w:i w:val="0"/>
-          <w:sz w:val="26"/>
-        </w:rPr>
-        <w:t>Định nghĩa correlation validation: logic phụ thuộc giữa các trường</w:t>
-      </w:r>
-    </w:p>
-    <w:p>
-      <w:pPr>
-        <w:pStyle w:val="ListBullet"/>
-        <w:spacing w:line="288" w:lineRule="auto"/>
-        <w:ind w:left="850" w:hanging="283"/>
-      </w:pPr>
-      <w:r>
-        <w:rPr>
-          <w:rFonts w:ascii="Times New Roman" w:hAnsi="Times New Roman" w:eastAsia="Times New Roman"/>
-          <w:b w:val="0"/>
-          <w:i w:val="0"/>
-          <w:sz w:val="26"/>
-        </w:rPr>
-        <w:t>Tạo Item Control document: điều kiện hiển thị/ẩn, enable/disable các fields</w:t>
-      </w:r>
-    </w:p>
-    <w:p>
-      <w:pPr>
-        <w:pStyle w:val="ListBullet"/>
-        <w:spacing w:line="288" w:lineRule="auto"/>
-        <w:ind w:left="850" w:hanging="283"/>
-      </w:pPr>
-      <w:r>
-        <w:rPr>
-          <w:rFonts w:ascii="Times New Roman" w:hAnsi="Times New Roman" w:eastAsia="Times New Roman"/>
-          <w:b w:val="0"/>
-          <w:i w:val="0"/>
-          <w:sz w:val="26"/>
-        </w:rPr>
-        <w:t>Training về thiết kế API RESTful</w:t>
-      </w:r>
-    </w:p>
-    <w:p>
-      <w:pPr>
-        <w:pStyle w:val="ListBullet"/>
-        <w:spacing w:line="288" w:lineRule="auto"/>
-        <w:ind w:left="850" w:hanging="283"/>
-      </w:pPr>
-      <w:r>
-        <w:rPr>
-          <w:rFonts w:ascii="Times New Roman" w:hAnsi="Times New Roman" w:eastAsia="Times New Roman"/>
-          <w:b w:val="0"/>
-          <w:i w:val="0"/>
-          <w:sz w:val="26"/>
-        </w:rPr>
-        <w:t>Học về HTTP methods, status codes, request/response structure</w:t>
-      </w:r>
-    </w:p>
-    <w:p>
-      <w:pPr>
-        <w:spacing w:line="288" w:lineRule="auto"/>
-        <w:ind w:firstLine="567"/>
-        <w:jc w:val="both"/>
-      </w:pPr>
-      <w:r>
-        <w:rPr>
-          <w:rFonts w:ascii="Times New Roman" w:hAnsi="Times New Roman" w:eastAsia="Times New Roman"/>
-          <w:b w:val="0"/>
-          <w:i w:val="0"/>
-          <w:sz w:val="26"/>
-        </w:rPr>
-        <w:t>Kỹ năng học được:</w:t>
-      </w:r>
-    </w:p>
-    <w:p>
-      <w:pPr>
-        <w:pStyle w:val="ListBullet"/>
-        <w:spacing w:line="288" w:lineRule="auto"/>
-        <w:ind w:left="850" w:hanging="283"/>
-      </w:pPr>
-      <w:r>
-        <w:rPr>
-          <w:rFonts w:ascii="Times New Roman" w:hAnsi="Times New Roman" w:eastAsia="Times New Roman"/>
-          <w:b w:val="0"/>
-          <w:i w:val="0"/>
-          <w:sz w:val="26"/>
-        </w:rPr>
-        <w:t>Kỹ năng thiết kế validation phức tạp với multiple conditions</w:t>
-      </w:r>
-    </w:p>
-    <w:p>
-      <w:pPr>
-        <w:pStyle w:val="ListBullet"/>
-        <w:spacing w:line="288" w:lineRule="auto"/>
-        <w:ind w:left="850" w:hanging="283"/>
-      </w:pPr>
-      <w:r>
-        <w:rPr>
-          <w:rFonts w:ascii="Times New Roman" w:hAnsi="Times New Roman" w:eastAsia="Times New Roman"/>
-          <w:b w:val="0"/>
-          <w:i w:val="0"/>
-          <w:sz w:val="26"/>
-        </w:rPr>
-        <w:t>Hiểu về state management trong màn hình (view mode vs edit mode)</w:t>
-      </w:r>
-    </w:p>
-    <w:p>
-      <w:pPr>
-        <w:pStyle w:val="ListBullet"/>
-        <w:spacing w:line="288" w:lineRule="auto"/>
-        <w:ind w:left="850" w:hanging="283"/>
-      </w:pPr>
-      <w:r>
-        <w:rPr>
-          <w:rFonts w:ascii="Times New Roman" w:hAnsi="Times New Roman" w:eastAsia="Times New Roman"/>
-          <w:b w:val="0"/>
-          <w:i w:val="0"/>
-          <w:sz w:val="26"/>
-        </w:rPr>
-        <w:t>Nắm vững các nguyên tắc thiết kế RESTful API</w:t>
-      </w:r>
-    </w:p>
-    <w:p>
-      <w:pPr>
-        <w:spacing w:line="288" w:lineRule="auto"/>
-        <w:ind w:firstLine="567"/>
-        <w:jc w:val="both"/>
-      </w:pPr>
-      <w:r>
-        <w:rPr>
-          <w:rFonts w:ascii="Times New Roman" w:hAnsi="Times New Roman" w:eastAsia="Times New Roman"/>
-          <w:b w:val="0"/>
-          <w:i w:val="0"/>
-          <w:sz w:val="26"/>
-        </w:rPr>
-        <w:t>Thách thức: Correlation validation đòi hỏi phải hiểu sâu về business rules và xử lý nhiều trường hợp đặc biệt.</w:t>
-      </w:r>
-    </w:p>
-    <w:p>
-      <w:pPr>
-        <w:spacing w:line="288" w:lineRule="auto"/>
-        <w:ind w:firstLine="567"/>
-        <w:jc w:val="both"/>
-      </w:pPr>
-      <w:r>
-        <w:rPr>
-          <w:rFonts w:ascii="Times New Roman" w:hAnsi="Times New Roman" w:eastAsia="Times New Roman"/>
-          <w:b w:val="0"/>
-          <w:i w:val="0"/>
-          <w:sz w:val="26"/>
-        </w:rPr>
-        <w:t>Kết quả: Hoàn thành thiết kế màn hình User Detail, sẵn sàng chuyển sang API Design.</w:t>
-      </w:r>
-    </w:p>
-    <w:p>
-      <w:pPr>
-        <w:pStyle w:val="Heading3"/>
-      </w:pPr>
-      <w:r>
-        <w:rPr>
-          <w:rFonts w:ascii="Times New Roman" w:hAnsi="Times New Roman" w:eastAsia="Times New Roman"/>
-          <w:b/>
-          <w:i w:val="0"/>
-          <w:color w:val="000000"/>
-          <w:sz w:val="28"/>
-        </w:rPr>
-        <w:t>Tuần 7: 12/01/2026 - 18/01/2026</w:t>
-      </w:r>
-    </w:p>
-    <w:p>
-      <w:pPr>
-        <w:spacing w:line="288" w:lineRule="auto"/>
-        <w:ind w:firstLine="567"/>
-        <w:jc w:val="both"/>
-      </w:pPr>
-      <w:r>
-        <w:rPr>
-          <w:rFonts w:ascii="Times New Roman" w:hAnsi="Times New Roman" w:eastAsia="Times New Roman"/>
-          <w:b w:val="0"/>
-          <w:i w:val="0"/>
-          <w:sz w:val="26"/>
-        </w:rPr>
-        <w:t>Công việc thực hiện:</w:t>
-      </w:r>
-    </w:p>
-    <w:p>
-      <w:pPr>
-        <w:pStyle w:val="ListBullet"/>
-        <w:spacing w:line="288" w:lineRule="auto"/>
-        <w:ind w:left="850" w:hanging="283"/>
-      </w:pPr>
-      <w:r>
-        <w:rPr>
-          <w:rFonts w:ascii="Times New Roman" w:hAnsi="Times New Roman" w:eastAsia="Times New Roman"/>
-          <w:b w:val="0"/>
-          <w:i w:val="0"/>
-          <w:sz w:val="26"/>
-        </w:rPr>
-        <w:t>Thực hành thiết kế API cho module User Management</w:t>
-      </w:r>
-    </w:p>
-    <w:p>
-      <w:pPr>
-        <w:pStyle w:val="ListBullet"/>
-        <w:spacing w:line="288" w:lineRule="auto"/>
-        <w:ind w:left="850" w:hanging="283"/>
-      </w:pPr>
-      <w:r>
-        <w:rPr>
-          <w:rFonts w:ascii="Times New Roman" w:hAnsi="Times New Roman" w:eastAsia="Times New Roman"/>
-          <w:b w:val="0"/>
-          <w:i w:val="0"/>
-          <w:sz w:val="26"/>
-        </w:rPr>
-        <w:t>Định nghĩa endpoints: GET /users, GET /users/:id, POST /users, PUT /users/:id, DELETE /users/:id</w:t>
-      </w:r>
-    </w:p>
-    <w:p>
-      <w:pPr>
-        <w:pStyle w:val="ListBullet"/>
-        <w:spacing w:line="288" w:lineRule="auto"/>
-        <w:ind w:left="850" w:hanging="283"/>
-      </w:pPr>
-      <w:r>
-        <w:rPr>
-          <w:rFonts w:ascii="Times New Roman" w:hAnsi="Times New Roman" w:eastAsia="Times New Roman"/>
-          <w:b w:val="0"/>
-          <w:i w:val="0"/>
-          <w:sz w:val="26"/>
-        </w:rPr>
-        <w:t>Thiết kế Request Parameters: query params, path params, request body</w:t>
-      </w:r>
-    </w:p>
-    <w:p>
-      <w:pPr>
-        <w:pStyle w:val="ListBullet"/>
-        <w:spacing w:line="288" w:lineRule="auto"/>
-        <w:ind w:left="850" w:hanging="283"/>
-      </w:pPr>
-      <w:r>
-        <w:rPr>
-          <w:rFonts w:ascii="Times New Roman" w:hAnsi="Times New Roman" w:eastAsia="Times New Roman"/>
-          <w:b w:val="0"/>
-          <w:i w:val="0"/>
-          <w:sz w:val="26"/>
-        </w:rPr>
-        <w:t>Thiết kế Response structure: status, data, message, pagination</w:t>
-      </w:r>
-    </w:p>
-    <w:p>
-      <w:pPr>
-        <w:pStyle w:val="ListBullet"/>
-        <w:spacing w:line="288" w:lineRule="auto"/>
-        <w:ind w:left="850" w:hanging="283"/>
-      </w:pPr>
-      <w:r>
-        <w:rPr>
-          <w:rFonts w:ascii="Times New Roman" w:hAnsi="Times New Roman" w:eastAsia="Times New Roman"/>
-          <w:b w:val="0"/>
-          <w:i w:val="0"/>
-          <w:sz w:val="26"/>
-        </w:rPr>
-        <w:t>Định nghĩa Error Handling với các status codes: 400, 401, 403, 404, 500</w:t>
-      </w:r>
-    </w:p>
-    <w:p>
-      <w:pPr>
-        <w:pStyle w:val="ListBullet"/>
-        <w:spacing w:line="288" w:lineRule="auto"/>
-        <w:ind w:left="850" w:hanging="283"/>
-      </w:pPr>
-      <w:r>
-        <w:rPr>
-          <w:rFonts w:ascii="Times New Roman" w:hAnsi="Times New Roman" w:eastAsia="Times New Roman"/>
-          <w:b w:val="0"/>
-          <w:i w:val="0"/>
-          <w:sz w:val="26"/>
-        </w:rPr>
-        <w:t>Được giới thiệu về Claude AI [4] để hỗ trợ kiểm tra thiết kế</w:t>
-      </w:r>
-    </w:p>
-    <w:p>
-      <w:pPr>
-        <w:spacing w:line="288" w:lineRule="auto"/>
-        <w:ind w:firstLine="567"/>
-        <w:jc w:val="both"/>
-      </w:pPr>
-      <w:r>
-        <w:rPr>
-          <w:rFonts w:ascii="Times New Roman" w:hAnsi="Times New Roman" w:eastAsia="Times New Roman"/>
-          <w:b w:val="0"/>
-          <w:i w:val="0"/>
-          <w:sz w:val="26"/>
-        </w:rPr>
-        <w:t>Kỹ năng học được:</w:t>
-      </w:r>
-    </w:p>
-    <w:p>
-      <w:pPr>
-        <w:pStyle w:val="ListBullet"/>
-        <w:spacing w:line="288" w:lineRule="auto"/>
-        <w:ind w:left="850" w:hanging="283"/>
-      </w:pPr>
-      <w:r>
-        <w:rPr>
-          <w:rFonts w:ascii="Times New Roman" w:hAnsi="Times New Roman" w:eastAsia="Times New Roman"/>
-          <w:b w:val="0"/>
-          <w:i w:val="0"/>
-          <w:sz w:val="26"/>
-        </w:rPr>
-        <w:t>Kỹ năng thiết kế RESTful API theo chuẩn resource-based</w:t>
-      </w:r>
-    </w:p>
-    <w:p>
-      <w:pPr>
-        <w:pStyle w:val="ListBullet"/>
-        <w:spacing w:line="288" w:lineRule="auto"/>
-        <w:ind w:left="850" w:hanging="283"/>
-      </w:pPr>
-      <w:r>
-        <w:rPr>
-          <w:rFonts w:ascii="Times New Roman" w:hAnsi="Times New Roman" w:eastAsia="Times New Roman"/>
-          <w:b w:val="0"/>
-          <w:i w:val="0"/>
-          <w:sz w:val="26"/>
-        </w:rPr>
-        <w:t>Hiểu về idempotency của các HTTP methods (GET, PUT, DELETE)</w:t>
-      </w:r>
-    </w:p>
-    <w:p>
-      <w:pPr>
-        <w:pStyle w:val="ListBullet"/>
-        <w:spacing w:line="288" w:lineRule="auto"/>
-        <w:ind w:left="850" w:hanging="283"/>
-      </w:pPr>
-      <w:r>
-        <w:rPr>
-          <w:rFonts w:ascii="Times New Roman" w:hAnsi="Times New Roman" w:eastAsia="Times New Roman"/>
-          <w:b w:val="0"/>
-          <w:i w:val="0"/>
-          <w:sz w:val="26"/>
-        </w:rPr>
-        <w:t>Biết cách sử dụng AI tools để review và cải thiện thiết kế</w:t>
-      </w:r>
-    </w:p>
-    <w:p>
-      <w:pPr>
-        <w:spacing w:line="288" w:lineRule="auto"/>
-        <w:ind w:firstLine="567"/>
-        <w:jc w:val="both"/>
-      </w:pPr>
-      <w:r>
-        <w:rPr>
-          <w:rFonts w:ascii="Times New Roman" w:hAnsi="Times New Roman" w:eastAsia="Times New Roman"/>
-          <w:b w:val="0"/>
-          <w:i w:val="0"/>
-          <w:sz w:val="26"/>
-        </w:rPr>
-        <w:t>Thách thức: Khó khăn trong việc thiết kế response structure nhất quán cho tất cả các API endpoints.</w:t>
-      </w:r>
-    </w:p>
-    <w:p>
-      <w:pPr>
-        <w:spacing w:line="288" w:lineRule="auto"/>
-        <w:ind w:firstLine="567"/>
-        <w:jc w:val="both"/>
-      </w:pPr>
-      <w:r>
-        <w:rPr>
-          <w:rFonts w:ascii="Times New Roman" w:hAnsi="Times New Roman" w:eastAsia="Times New Roman"/>
-          <w:b w:val="0"/>
-          <w:i w:val="0"/>
-          <w:sz w:val="26"/>
-        </w:rPr>
-        <w:t>Kết quả: Hoàn thành thiết kế 5 APIs chính cho User Management với đầy đủ request/response specs.</w:t>
-      </w:r>
-    </w:p>
-    <w:p>
-      <w:pPr>
-        <w:pStyle w:val="Heading3"/>
-      </w:pPr>
-      <w:r>
-        <w:rPr>
-          <w:rFonts w:ascii="Times New Roman" w:hAnsi="Times New Roman" w:eastAsia="Times New Roman"/>
-          <w:b/>
-          <w:i w:val="0"/>
-          <w:color w:val="000000"/>
-          <w:sz w:val="28"/>
-        </w:rPr>
-        <w:t>Tuần 8: 19/01/2026 - 25/01/2026</w:t>
-      </w:r>
-    </w:p>
-    <w:p>
-      <w:pPr>
-        <w:spacing w:line="288" w:lineRule="auto"/>
-        <w:ind w:firstLine="567"/>
-        <w:jc w:val="both"/>
-      </w:pPr>
-      <w:r>
-        <w:rPr>
-          <w:rFonts w:ascii="Times New Roman" w:hAnsi="Times New Roman" w:eastAsia="Times New Roman"/>
-          <w:b w:val="0"/>
-          <w:i w:val="0"/>
-          <w:sz w:val="26"/>
-        </w:rPr>
-        <w:t>Công việc thực hiện:</w:t>
-      </w:r>
-    </w:p>
-    <w:p>
-      <w:pPr>
-        <w:pStyle w:val="ListBullet"/>
-        <w:spacing w:line="288" w:lineRule="auto"/>
-        <w:ind w:left="850" w:hanging="283"/>
-      </w:pPr>
-      <w:r>
-        <w:rPr>
-          <w:rFonts w:ascii="Times New Roman" w:hAnsi="Times New Roman" w:eastAsia="Times New Roman"/>
-          <w:b w:val="0"/>
-          <w:i w:val="0"/>
-          <w:sz w:val="26"/>
-        </w:rPr>
-        <w:t>Tiếp tục thiết kế APIs cho module Course Management</w:t>
-      </w:r>
-    </w:p>
-    <w:p>
-      <w:pPr>
-        <w:pStyle w:val="ListBullet"/>
-        <w:spacing w:line="288" w:lineRule="auto"/>
-        <w:ind w:left="850" w:hanging="283"/>
-      </w:pPr>
-      <w:r>
-        <w:rPr>
-          <w:rFonts w:ascii="Times New Roman" w:hAnsi="Times New Roman" w:eastAsia="Times New Roman"/>
-          <w:b w:val="0"/>
-          <w:i w:val="0"/>
-          <w:sz w:val="26"/>
-        </w:rPr>
-        <w:t>Thực hành sử dụng Claude AI để kiểm tra chất lượng API design</w:t>
-      </w:r>
-    </w:p>
-    <w:p>
-      <w:pPr>
-        <w:pStyle w:val="ListBullet"/>
-        <w:spacing w:line="288" w:lineRule="auto"/>
-        <w:ind w:left="850" w:hanging="283"/>
-      </w:pPr>
-      <w:r>
-        <w:rPr>
-          <w:rFonts w:ascii="Times New Roman" w:hAnsi="Times New Roman" w:eastAsia="Times New Roman"/>
-          <w:b w:val="0"/>
-          <w:i w:val="0"/>
-          <w:sz w:val="26"/>
-        </w:rPr>
-        <w:t>Fix các issues được AI phát hiện: naming inconsistency, missing error cases, incomplete documentation</w:t>
-      </w:r>
-    </w:p>
-    <w:p>
-      <w:pPr>
-        <w:pStyle w:val="ListBullet"/>
-        <w:spacing w:line="288" w:lineRule="auto"/>
-        <w:ind w:left="850" w:hanging="283"/>
-      </w:pPr>
-      <w:r>
-        <w:rPr>
-          <w:rFonts w:ascii="Times New Roman" w:hAnsi="Times New Roman" w:eastAsia="Times New Roman"/>
-          <w:b w:val="0"/>
-          <w:i w:val="0"/>
-          <w:sz w:val="26"/>
-        </w:rPr>
-        <w:t>Training về Spring Batch và Batch Processing</w:t>
-      </w:r>
-    </w:p>
-    <w:p>
-      <w:pPr>
-        <w:pStyle w:val="ListBullet"/>
-        <w:spacing w:line="288" w:lineRule="auto"/>
-        <w:ind w:left="850" w:hanging="283"/>
-      </w:pPr>
-      <w:r>
-        <w:rPr>
-          <w:rFonts w:ascii="Times New Roman" w:hAnsi="Times New Roman" w:eastAsia="Times New Roman"/>
-          <w:b w:val="0"/>
-          <w:i w:val="0"/>
-          <w:sz w:val="26"/>
-        </w:rPr>
-        <w:t>Học về Job, Step, ItemReader, ItemProcessor, ItemWriter</w:t>
-      </w:r>
-    </w:p>
-    <w:p>
-      <w:pPr>
-        <w:spacing w:line="288" w:lineRule="auto"/>
-        <w:ind w:firstLine="567"/>
-        <w:jc w:val="both"/>
-      </w:pPr>
-      <w:r>
-        <w:rPr>
-          <w:rFonts w:ascii="Times New Roman" w:hAnsi="Times New Roman" w:eastAsia="Times New Roman"/>
-          <w:b w:val="0"/>
-          <w:i w:val="0"/>
-          <w:sz w:val="26"/>
-        </w:rPr>
-        <w:t>Kỹ năng học được:</w:t>
-      </w:r>
-    </w:p>
-    <w:p>
-      <w:pPr>
-        <w:pStyle w:val="ListBullet"/>
-        <w:spacing w:line="288" w:lineRule="auto"/>
-        <w:ind w:left="850" w:hanging="283"/>
-      </w:pPr>
-      <w:r>
-        <w:rPr>
-          <w:rFonts w:ascii="Times New Roman" w:hAnsi="Times New Roman" w:eastAsia="Times New Roman"/>
-          <w:b w:val="0"/>
-          <w:i w:val="0"/>
-          <w:sz w:val="26"/>
-        </w:rPr>
-        <w:t>Kỹ năng viết API documentation rõ ràng, đầy đủ</w:t>
-      </w:r>
-    </w:p>
-    <w:p>
-      <w:pPr>
-        <w:pStyle w:val="ListBullet"/>
-        <w:spacing w:line="288" w:lineRule="auto"/>
-        <w:ind w:left="850" w:hanging="283"/>
-      </w:pPr>
-      <w:r>
-        <w:rPr>
-          <w:rFonts w:ascii="Times New Roman" w:hAnsi="Times New Roman" w:eastAsia="Times New Roman"/>
-          <w:b w:val="0"/>
-          <w:i w:val="0"/>
-          <w:sz w:val="26"/>
-        </w:rPr>
-        <w:t>Hiểu về kiến trúc chunk processing trong Spring Batch</w:t>
-      </w:r>
-    </w:p>
-    <w:p>
-      <w:pPr>
-        <w:pStyle w:val="ListBullet"/>
-        <w:spacing w:line="288" w:lineRule="auto"/>
-        <w:ind w:left="850" w:hanging="283"/>
-      </w:pPr>
-      <w:r>
-        <w:rPr>
-          <w:rFonts w:ascii="Times New Roman" w:hAnsi="Times New Roman" w:eastAsia="Times New Roman"/>
-          <w:b w:val="0"/>
-          <w:i w:val="0"/>
-          <w:sz w:val="26"/>
-        </w:rPr>
-        <w:t>Biết cách integrate AI vào workflow để nâng cao chất lượng</w:t>
-      </w:r>
-    </w:p>
-    <w:p>
-      <w:pPr>
-        <w:spacing w:line="288" w:lineRule="auto"/>
-        <w:ind w:firstLine="567"/>
-        <w:jc w:val="both"/>
-      </w:pPr>
-      <w:r>
-        <w:rPr>
-          <w:rFonts w:ascii="Times New Roman" w:hAnsi="Times New Roman" w:eastAsia="Times New Roman"/>
-          <w:b w:val="0"/>
-          <w:i w:val="0"/>
-          <w:sz w:val="26"/>
-        </w:rPr>
-        <w:t>Thách thức: Cần học cách đặt câu hỏi hiệu quả với AI để nhận được feedback hữu ích.</w:t>
-      </w:r>
-    </w:p>
-    <w:p>
-      <w:pPr>
-        <w:spacing w:line="288" w:lineRule="auto"/>
-        <w:ind w:firstLine="567"/>
-        <w:jc w:val="both"/>
-      </w:pPr>
-      <w:r>
-        <w:rPr>
-          <w:rFonts w:ascii="Times New Roman" w:hAnsi="Times New Roman" w:eastAsia="Times New Roman"/>
-          <w:b w:val="0"/>
-          <w:i w:val="0"/>
-          <w:sz w:val="26"/>
-        </w:rPr>
-        <w:t>Kết quả: Hoàn thành thiết kế APIs cho Course Management, hiểu được cơ bản về Spring Batch.</w:t>
-      </w:r>
-    </w:p>
-    <w:p>
-      <w:pPr>
-        <w:pStyle w:val="Heading3"/>
-      </w:pPr>
-      <w:r>
-        <w:rPr>
-          <w:rFonts w:ascii="Times New Roman" w:hAnsi="Times New Roman" w:eastAsia="Times New Roman"/>
-          <w:b/>
-          <w:i w:val="0"/>
-          <w:color w:val="000000"/>
-          <w:sz w:val="28"/>
-        </w:rPr>
-        <w:t>Tuần 9: 26/01/2026 - 01/02/2026</w:t>
-      </w:r>
-    </w:p>
-    <w:p>
-      <w:pPr>
-        <w:spacing w:line="288" w:lineRule="auto"/>
-        <w:ind w:firstLine="567"/>
-        <w:jc w:val="both"/>
-      </w:pPr>
-      <w:r>
-        <w:rPr>
-          <w:rFonts w:ascii="Times New Roman" w:hAnsi="Times New Roman" w:eastAsia="Times New Roman"/>
-          <w:b w:val="0"/>
-          <w:i w:val="0"/>
-          <w:sz w:val="26"/>
-        </w:rPr>
-        <w:t>Công việc thực hiện:</w:t>
-      </w:r>
-    </w:p>
-    <w:p>
-      <w:pPr>
-        <w:pStyle w:val="ListBullet"/>
-        <w:spacing w:line="288" w:lineRule="auto"/>
-        <w:ind w:left="850" w:hanging="283"/>
-      </w:pPr>
-      <w:r>
-        <w:rPr>
-          <w:rFonts w:ascii="Times New Roman" w:hAnsi="Times New Roman" w:eastAsia="Times New Roman"/>
-          <w:b w:val="0"/>
-          <w:i w:val="0"/>
-          <w:sz w:val="26"/>
-        </w:rPr>
-        <w:t>Thực hành thiết kế Batch Job: Import User Data từ CSV file</w:t>
-      </w:r>
-    </w:p>
-    <w:p>
-      <w:pPr>
-        <w:pStyle w:val="ListBullet"/>
-        <w:spacing w:line="288" w:lineRule="auto"/>
-        <w:ind w:left="850" w:hanging="283"/>
-      </w:pPr>
-      <w:r>
-        <w:rPr>
-          <w:rFonts w:ascii="Times New Roman" w:hAnsi="Times New Roman" w:eastAsia="Times New Roman"/>
-          <w:b w:val="0"/>
-          <w:i w:val="0"/>
-          <w:sz w:val="26"/>
-        </w:rPr>
-        <w:t>Định nghĩa Job structure với 5 blocks: Chuẩn bị, Khởi tạo, Kiểm tra, Xử lý chính, Kết thúc</w:t>
-      </w:r>
-    </w:p>
-    <w:p>
-      <w:pPr>
-        <w:pStyle w:val="ListBullet"/>
-        <w:spacing w:line="288" w:lineRule="auto"/>
-        <w:ind w:left="850" w:hanging="283"/>
-      </w:pPr>
-      <w:r>
-        <w:rPr>
-          <w:rFonts w:ascii="Times New Roman" w:hAnsi="Times New Roman" w:eastAsia="Times New Roman"/>
-          <w:b w:val="0"/>
-          <w:i w:val="0"/>
-          <w:sz w:val="26"/>
-        </w:rPr>
-        <w:t>Thiết kế Shell Script với input parameters và return codes</w:t>
-      </w:r>
-    </w:p>
-    <w:p>
-      <w:pPr>
-        <w:pStyle w:val="ListBullet"/>
-        <w:spacing w:line="288" w:lineRule="auto"/>
-        <w:ind w:left="850" w:hanging="283"/>
-      </w:pPr>
-      <w:r>
-        <w:rPr>
-          <w:rFonts w:ascii="Times New Roman" w:hAnsi="Times New Roman" w:eastAsia="Times New Roman"/>
-          <w:b w:val="0"/>
-          <w:i w:val="0"/>
-          <w:sz w:val="26"/>
-        </w:rPr>
-        <w:t>Viết pseudo code cho ItemReader (đọc CSV), ItemProcessor (validate &amp; transform), ItemWriter (insert DB)</w:t>
-      </w:r>
-    </w:p>
-    <w:p>
-      <w:pPr>
-        <w:pStyle w:val="ListBullet"/>
-        <w:spacing w:line="288" w:lineRule="auto"/>
-        <w:ind w:left="850" w:hanging="283"/>
-      </w:pPr>
-      <w:r>
-        <w:rPr>
-          <w:rFonts w:ascii="Times New Roman" w:hAnsi="Times New Roman" w:eastAsia="Times New Roman"/>
-          <w:b w:val="0"/>
-          <w:i w:val="0"/>
-          <w:sz w:val="26"/>
-        </w:rPr>
-        <w:t>Định nghĩa SQL queries cho SELECT, INSERT, UPDATE operations</w:t>
-      </w:r>
-    </w:p>
-    <w:p>
-      <w:pPr>
-        <w:spacing w:line="288" w:lineRule="auto"/>
-        <w:ind w:firstLine="567"/>
-        <w:jc w:val="both"/>
-      </w:pPr>
-      <w:r>
-        <w:rPr>
-          <w:rFonts w:ascii="Times New Roman" w:hAnsi="Times New Roman" w:eastAsia="Times New Roman"/>
-          <w:b w:val="0"/>
-          <w:i w:val="0"/>
-          <w:sz w:val="26"/>
-        </w:rPr>
-        <w:t>Kỹ năng học được:</w:t>
-      </w:r>
-    </w:p>
-    <w:p>
-      <w:pPr>
-        <w:pStyle w:val="ListBullet"/>
-        <w:spacing w:line="288" w:lineRule="auto"/>
-        <w:ind w:left="850" w:hanging="283"/>
-      </w:pPr>
-      <w:r>
-        <w:rPr>
-          <w:rFonts w:ascii="Times New Roman" w:hAnsi="Times New Roman" w:eastAsia="Times New Roman"/>
-          <w:b w:val="0"/>
-          <w:i w:val="0"/>
-          <w:sz w:val="26"/>
-        </w:rPr>
-        <w:t>Kỹ năng phân tích batch requirements và chia nhỏ thành steps</w:t>
-      </w:r>
-    </w:p>
-    <w:p>
-      <w:pPr>
-        <w:pStyle w:val="ListBullet"/>
-        <w:spacing w:line="288" w:lineRule="auto"/>
-        <w:ind w:left="850" w:hanging="283"/>
-      </w:pPr>
-      <w:r>
-        <w:rPr>
-          <w:rFonts w:ascii="Times New Roman" w:hAnsi="Times New Roman" w:eastAsia="Times New Roman"/>
-          <w:b w:val="0"/>
-          <w:i w:val="0"/>
-          <w:sz w:val="26"/>
-        </w:rPr>
-        <w:t>Hiểu về transaction management trong batch processing</w:t>
-      </w:r>
-    </w:p>
-    <w:p>
-      <w:pPr>
-        <w:pStyle w:val="ListBullet"/>
-        <w:spacing w:line="288" w:lineRule="auto"/>
-        <w:ind w:left="850" w:hanging="283"/>
-      </w:pPr>
-      <w:r>
-        <w:rPr>
-          <w:rFonts w:ascii="Times New Roman" w:hAnsi="Times New Roman" w:eastAsia="Times New Roman"/>
-          <w:b w:val="0"/>
-          <w:i w:val="0"/>
-          <w:sz w:val="26"/>
-        </w:rPr>
-        <w:t>Biết cách xử lý error và rollback trong chunk processing</w:t>
-      </w:r>
-    </w:p>
-    <w:p>
-      <w:pPr>
-        <w:spacing w:line="288" w:lineRule="auto"/>
-        <w:ind w:firstLine="567"/>
-        <w:jc w:val="both"/>
-      </w:pPr>
-      <w:r>
-        <w:rPr>
-          <w:rFonts w:ascii="Times New Roman" w:hAnsi="Times New Roman" w:eastAsia="Times New Roman"/>
-          <w:b w:val="0"/>
-          <w:i w:val="0"/>
-          <w:sz w:val="26"/>
-        </w:rPr>
-        <w:t>Thách thức: Batch design phức tạp hơn API vì phải xử lý volume lớn dữ liệu và nhiều error scenarios.</w:t>
-      </w:r>
-    </w:p>
-    <w:p>
-      <w:pPr>
-        <w:spacing w:line="288" w:lineRule="auto"/>
-        <w:ind w:firstLine="567"/>
-        <w:jc w:val="both"/>
-      </w:pPr>
-      <w:r>
-        <w:rPr>
-          <w:rFonts w:ascii="Times New Roman" w:hAnsi="Times New Roman" w:eastAsia="Times New Roman"/>
-          <w:b w:val="0"/>
-          <w:i w:val="0"/>
-          <w:sz w:val="26"/>
-        </w:rPr>
-        <w:t>Kết quả: Hoàn thành thiết kế Batch Job đầu tiên với đầy đủ 5 blocks và SQL queries.</w:t>
-      </w:r>
-    </w:p>
-    <w:p>
-      <w:pPr>
-        <w:pStyle w:val="Heading3"/>
-      </w:pPr>
-      <w:r>
-        <w:rPr>
-          <w:rFonts w:ascii="Times New Roman" w:hAnsi="Times New Roman" w:eastAsia="Times New Roman"/>
-          <w:b/>
-          <w:i w:val="0"/>
-          <w:color w:val="000000"/>
-          <w:sz w:val="28"/>
-        </w:rPr>
-        <w:t>Tuần 10: 02/02/2026 - 08/02/2026</w:t>
-      </w:r>
-    </w:p>
-    <w:p>
-      <w:pPr>
-        <w:spacing w:line="288" w:lineRule="auto"/>
-        <w:ind w:firstLine="567"/>
-        <w:jc w:val="both"/>
-      </w:pPr>
-      <w:r>
-        <w:rPr>
-          <w:rFonts w:ascii="Times New Roman" w:hAnsi="Times New Roman" w:eastAsia="Times New Roman"/>
-          <w:b w:val="0"/>
-          <w:i w:val="0"/>
-          <w:sz w:val="26"/>
-        </w:rPr>
-        <w:t>Công việc thực hiện:</w:t>
-      </w:r>
-    </w:p>
-    <w:p>
-      <w:pPr>
-        <w:pStyle w:val="ListBullet"/>
-        <w:spacing w:line="288" w:lineRule="auto"/>
-        <w:ind w:left="850" w:hanging="283"/>
-      </w:pPr>
-      <w:r>
-        <w:rPr>
-          <w:rFonts w:ascii="Times New Roman" w:hAnsi="Times New Roman" w:eastAsia="Times New Roman"/>
-          <w:b w:val="0"/>
-          <w:i w:val="0"/>
-          <w:sz w:val="26"/>
-        </w:rPr>
-        <w:t>Tiếp tục thiết kế Batch Job: Generate Monthly Report</w:t>
-      </w:r>
-    </w:p>
-    <w:p>
-      <w:pPr>
-        <w:pStyle w:val="ListBullet"/>
-        <w:spacing w:line="288" w:lineRule="auto"/>
-        <w:ind w:left="850" w:hanging="283"/>
-      </w:pPr>
-      <w:r>
-        <w:rPr>
-          <w:rFonts w:ascii="Times New Roman" w:hAnsi="Times New Roman" w:eastAsia="Times New Roman"/>
-          <w:b w:val="0"/>
-          <w:i w:val="0"/>
-          <w:sz w:val="26"/>
-        </w:rPr>
-        <w:t>Áp dụng kiến thức về Spring Batch chunk processing (chunk size = 1000)</w:t>
-      </w:r>
-    </w:p>
-    <w:p>
-      <w:pPr>
-        <w:pStyle w:val="ListBullet"/>
-        <w:spacing w:line="288" w:lineRule="auto"/>
-        <w:ind w:left="850" w:hanging="283"/>
-      </w:pPr>
-      <w:r>
-        <w:rPr>
-          <w:rFonts w:ascii="Times New Roman" w:hAnsi="Times New Roman" w:eastAsia="Times New Roman"/>
-          <w:b w:val="0"/>
-          <w:i w:val="0"/>
-          <w:sz w:val="26"/>
-        </w:rPr>
-        <w:t>Xử lý feedback (Shiteki) đợt 1 từ Leader Review</w:t>
-      </w:r>
-    </w:p>
-    <w:p>
-      <w:pPr>
-        <w:pStyle w:val="ListBullet"/>
-        <w:spacing w:line="288" w:lineRule="auto"/>
-        <w:ind w:left="850" w:hanging="283"/>
-      </w:pPr>
-      <w:r>
-        <w:rPr>
-          <w:rFonts w:ascii="Times New Roman" w:hAnsi="Times New Roman" w:eastAsia="Times New Roman"/>
-          <w:b w:val="0"/>
-          <w:i w:val="0"/>
-          <w:sz w:val="26"/>
-        </w:rPr>
-        <w:t>Fix các lỗi: logic sai, thiếu validation, inconsistent naming</w:t>
-      </w:r>
-    </w:p>
-    <w:p>
-      <w:pPr>
-        <w:pStyle w:val="ListBullet"/>
-        <w:spacing w:line="288" w:lineRule="auto"/>
-        <w:ind w:left="850" w:hanging="283"/>
-      </w:pPr>
-      <w:r>
-        <w:rPr>
-          <w:rFonts w:ascii="Times New Roman" w:hAnsi="Times New Roman" w:eastAsia="Times New Roman"/>
-          <w:b w:val="0"/>
-          <w:i w:val="0"/>
-          <w:sz w:val="26"/>
-        </w:rPr>
-        <w:t>Refactor thiết kế để đảm bảo tính nhất quán giữa DB, Screen, API, Batch</w:t>
-      </w:r>
-    </w:p>
-    <w:p>
-      <w:pPr>
-        <w:spacing w:line="288" w:lineRule="auto"/>
-        <w:ind w:firstLine="567"/>
-        <w:jc w:val="both"/>
-      </w:pPr>
-      <w:r>
-        <w:rPr>
-          <w:rFonts w:ascii="Times New Roman" w:hAnsi="Times New Roman" w:eastAsia="Times New Roman"/>
-          <w:b w:val="0"/>
-          <w:i w:val="0"/>
-          <w:sz w:val="26"/>
-        </w:rPr>
-        <w:t>Kỹ năng học được:</w:t>
-      </w:r>
-    </w:p>
-    <w:p>
-      <w:pPr>
-        <w:pStyle w:val="ListBullet"/>
-        <w:spacing w:line="288" w:lineRule="auto"/>
-        <w:ind w:left="850" w:hanging="283"/>
-      </w:pPr>
-      <w:r>
-        <w:rPr>
-          <w:rFonts w:ascii="Times New Roman" w:hAnsi="Times New Roman" w:eastAsia="Times New Roman"/>
-          <w:b w:val="0"/>
-          <w:i w:val="0"/>
-          <w:sz w:val="26"/>
-        </w:rPr>
-        <w:t>Kỹ năng xử lý review feedback một cách có hệ thống</w:t>
-      </w:r>
-    </w:p>
-    <w:p>
-      <w:pPr>
-        <w:pStyle w:val="ListBullet"/>
-        <w:spacing w:line="288" w:lineRule="auto"/>
-        <w:ind w:left="850" w:hanging="283"/>
-      </w:pPr>
-      <w:r>
-        <w:rPr>
-          <w:rFonts w:ascii="Times New Roman" w:hAnsi="Times New Roman" w:eastAsia="Times New Roman"/>
-          <w:b w:val="0"/>
-          <w:i w:val="0"/>
-          <w:sz w:val="26"/>
-        </w:rPr>
-        <w:t>Hiểu tầm quan trọng của consistency trong thiết kế</w:t>
-      </w:r>
-    </w:p>
-    <w:p>
-      <w:pPr>
-        <w:pStyle w:val="ListBullet"/>
-        <w:spacing w:line="288" w:lineRule="auto"/>
-        <w:ind w:left="850" w:hanging="283"/>
-      </w:pPr>
-      <w:r>
-        <w:rPr>
-          <w:rFonts w:ascii="Times New Roman" w:hAnsi="Times New Roman" w:eastAsia="Times New Roman"/>
-          <w:b w:val="0"/>
-          <w:i w:val="0"/>
-          <w:sz w:val="26"/>
-        </w:rPr>
-        <w:t>Biết cách tự review thiết kế trước khi submit</w:t>
-      </w:r>
-    </w:p>
-    <w:p>
-      <w:pPr>
-        <w:spacing w:line="288" w:lineRule="auto"/>
-        <w:ind w:firstLine="567"/>
-        <w:jc w:val="both"/>
-      </w:pPr>
-      <w:r>
-        <w:rPr>
-          <w:rFonts w:ascii="Times New Roman" w:hAnsi="Times New Roman" w:eastAsia="Times New Roman"/>
-          <w:b w:val="0"/>
-          <w:i w:val="0"/>
-          <w:sz w:val="26"/>
-        </w:rPr>
-        <w:t>Thách thức: Một số feedback yêu cầu sửa đổi lớn, ảnh hưởng đến nhiều phần của thiết kế.</w:t>
-      </w:r>
-    </w:p>
-    <w:p>
-      <w:pPr>
-        <w:spacing w:line="288" w:lineRule="auto"/>
-        <w:ind w:firstLine="567"/>
-        <w:jc w:val="both"/>
-      </w:pPr>
-      <w:r>
-        <w:rPr>
-          <w:rFonts w:ascii="Times New Roman" w:hAnsi="Times New Roman" w:eastAsia="Times New Roman"/>
-          <w:b w:val="0"/>
-          <w:i w:val="0"/>
-          <w:sz w:val="26"/>
-        </w:rPr>
-        <w:t>Kết quả: Hoàn thành Batch Job thứ 2, xử lý xong 80% feedback đợt 1.</w:t>
-      </w:r>
-    </w:p>
-    <w:p>
-      <w:pPr>
-        <w:pStyle w:val="Heading3"/>
-      </w:pPr>
-      <w:r>
-        <w:rPr>
-          <w:rFonts w:ascii="Times New Roman" w:hAnsi="Times New Roman" w:eastAsia="Times New Roman"/>
-          <w:b/>
-          <w:i w:val="0"/>
-          <w:color w:val="000000"/>
-          <w:sz w:val="28"/>
-        </w:rPr>
-        <w:t>Tuần 11: 09/02/2026 - 15/02/2026</w:t>
-      </w:r>
-    </w:p>
-    <w:p>
-      <w:pPr>
-        <w:spacing w:line="288" w:lineRule="auto"/>
-        <w:ind w:firstLine="567"/>
-        <w:jc w:val="both"/>
-      </w:pPr>
-      <w:r>
-        <w:rPr>
-          <w:rFonts w:ascii="Times New Roman" w:hAnsi="Times New Roman" w:eastAsia="Times New Roman"/>
-          <w:b w:val="0"/>
-          <w:i w:val="0"/>
-          <w:sz w:val="26"/>
-        </w:rPr>
-        <w:t>Công việc thực hiện:</w:t>
-      </w:r>
-    </w:p>
-    <w:p>
-      <w:pPr>
-        <w:pStyle w:val="ListBullet"/>
-        <w:spacing w:line="288" w:lineRule="auto"/>
-        <w:ind w:left="850" w:hanging="283"/>
-      </w:pPr>
-      <w:r>
-        <w:rPr>
-          <w:rFonts w:ascii="Times New Roman" w:hAnsi="Times New Roman" w:eastAsia="Times New Roman"/>
-          <w:b w:val="0"/>
-          <w:i w:val="0"/>
-          <w:sz w:val="26"/>
-        </w:rPr>
-        <w:t>Hoàn thành xử lý feedback đợt 1, submit lại cho review</w:t>
-      </w:r>
-    </w:p>
-    <w:p>
-      <w:pPr>
-        <w:pStyle w:val="ListBullet"/>
-        <w:spacing w:line="288" w:lineRule="auto"/>
-        <w:ind w:left="850" w:hanging="283"/>
-      </w:pPr>
-      <w:r>
-        <w:rPr>
-          <w:rFonts w:ascii="Times New Roman" w:hAnsi="Times New Roman" w:eastAsia="Times New Roman"/>
-          <w:b w:val="0"/>
-          <w:i w:val="0"/>
-          <w:sz w:val="26"/>
-        </w:rPr>
-        <w:t>Thực hiện thiết kế độc lập cho module Enrollment Management</w:t>
-      </w:r>
-    </w:p>
-    <w:p>
-      <w:pPr>
-        <w:pStyle w:val="ListBullet"/>
-        <w:spacing w:line="288" w:lineRule="auto"/>
-        <w:ind w:left="850" w:hanging="283"/>
-      </w:pPr>
-      <w:r>
-        <w:rPr>
-          <w:rFonts w:ascii="Times New Roman" w:hAnsi="Times New Roman" w:eastAsia="Times New Roman"/>
-          <w:b w:val="0"/>
-          <w:i w:val="0"/>
-          <w:sz w:val="26"/>
-        </w:rPr>
-        <w:t>Áp dụng tất cả kiến thức đã học: DB, Screen, API, Batch design</w:t>
-      </w:r>
-    </w:p>
-    <w:p>
-      <w:pPr>
-        <w:pStyle w:val="ListBullet"/>
-        <w:spacing w:line="288" w:lineRule="auto"/>
-        <w:ind w:left="850" w:hanging="283"/>
-      </w:pPr>
-      <w:r>
-        <w:rPr>
-          <w:rFonts w:ascii="Times New Roman" w:hAnsi="Times New Roman" w:eastAsia="Times New Roman"/>
-          <w:b w:val="0"/>
-          <w:i w:val="0"/>
-          <w:sz w:val="26"/>
-        </w:rPr>
-        <w:t>Sử dụng Claude AI để tự review thiết kế trước khi submit</w:t>
-      </w:r>
-    </w:p>
-    <w:p>
-      <w:pPr>
-        <w:pStyle w:val="ListBullet"/>
-        <w:spacing w:line="288" w:lineRule="auto"/>
-        <w:ind w:left="850" w:hanging="283"/>
-      </w:pPr>
-      <w:r>
-        <w:rPr>
-          <w:rFonts w:ascii="Times New Roman" w:hAnsi="Times New Roman" w:eastAsia="Times New Roman"/>
-          <w:b w:val="0"/>
-          <w:i w:val="0"/>
-          <w:sz w:val="26"/>
-        </w:rPr>
-        <w:t>Tổng hợp tất cả tài liệu thiết kế theo chuẩn template</w:t>
-      </w:r>
-    </w:p>
-    <w:p>
-      <w:pPr>
-        <w:spacing w:line="288" w:lineRule="auto"/>
-        <w:ind w:firstLine="567"/>
-        <w:jc w:val="both"/>
-      </w:pPr>
-      <w:r>
-        <w:rPr>
-          <w:rFonts w:ascii="Times New Roman" w:hAnsi="Times New Roman" w:eastAsia="Times New Roman"/>
-          <w:b w:val="0"/>
-          <w:i w:val="0"/>
-          <w:sz w:val="26"/>
-        </w:rPr>
-        <w:t>Kỹ năng học được:</w:t>
-      </w:r>
-    </w:p>
-    <w:p>
-      <w:pPr>
-        <w:pStyle w:val="ListBullet"/>
-        <w:spacing w:line="288" w:lineRule="auto"/>
-        <w:ind w:left="850" w:hanging="283"/>
-      </w:pPr>
-      <w:r>
-        <w:rPr>
-          <w:rFonts w:ascii="Times New Roman" w:hAnsi="Times New Roman" w:eastAsia="Times New Roman"/>
-          <w:b w:val="0"/>
-          <w:i w:val="0"/>
-          <w:sz w:val="26"/>
-        </w:rPr>
-        <w:t>Kỹ năng làm việc độc lập từ phân tích yêu cầu đến hoàn thiện thiết kế</w:t>
-      </w:r>
-    </w:p>
-    <w:p>
-      <w:pPr>
-        <w:pStyle w:val="ListBullet"/>
-        <w:spacing w:line="288" w:lineRule="auto"/>
-        <w:ind w:left="850" w:hanging="283"/>
-      </w:pPr>
-      <w:r>
-        <w:rPr>
-          <w:rFonts w:ascii="Times New Roman" w:hAnsi="Times New Roman" w:eastAsia="Times New Roman"/>
-          <w:b w:val="0"/>
-          <w:i w:val="0"/>
-          <w:sz w:val="26"/>
-        </w:rPr>
-        <w:t>Khả năng tự kiểm tra chất lượng và phát hiện lỗi trước khi submit</w:t>
-      </w:r>
-    </w:p>
-    <w:p>
-      <w:pPr>
-        <w:pStyle w:val="ListBullet"/>
-        <w:spacing w:line="288" w:lineRule="auto"/>
-        <w:ind w:left="850" w:hanging="283"/>
-      </w:pPr>
-      <w:r>
-        <w:rPr>
-          <w:rFonts w:ascii="Times New Roman" w:hAnsi="Times New Roman" w:eastAsia="Times New Roman"/>
-          <w:b w:val="0"/>
-          <w:i w:val="0"/>
-          <w:sz w:val="26"/>
-        </w:rPr>
-        <w:t>Time management: hoàn thành đúng deadline</w:t>
-      </w:r>
-    </w:p>
-    <w:p>
-      <w:pPr>
-        <w:spacing w:line="288" w:lineRule="auto"/>
-        <w:ind w:firstLine="567"/>
-        <w:jc w:val="both"/>
-      </w:pPr>
-      <w:r>
-        <w:rPr>
-          <w:rFonts w:ascii="Times New Roman" w:hAnsi="Times New Roman" w:eastAsia="Times New Roman"/>
-          <w:b w:val="0"/>
-          <w:i w:val="0"/>
-          <w:sz w:val="26"/>
-        </w:rPr>
-        <w:t>Thách thức: Làm việc độc lập đòi hỏi chủ động cao và khả năng tự giải quyết vấn đề.</w:t>
-      </w:r>
-    </w:p>
-    <w:p>
-      <w:pPr>
-        <w:spacing w:line="288" w:lineRule="auto"/>
-        <w:ind w:firstLine="567"/>
-        <w:jc w:val="both"/>
-      </w:pPr>
-      <w:r>
-        <w:rPr>
-          <w:rFonts w:ascii="Times New Roman" w:hAnsi="Times New Roman" w:eastAsia="Times New Roman"/>
-          <w:b w:val="0"/>
-          <w:i w:val="0"/>
-          <w:sz w:val="26"/>
-        </w:rPr>
-        <w:t>Kết quả: Hoàn thành thiết kế module Enrollment Management, pass review ngay lần đầu.</w:t>
-      </w:r>
-    </w:p>
-    <w:p>
-      <w:pPr>
-        <w:pStyle w:val="Heading3"/>
-      </w:pPr>
-      <w:r>
-        <w:rPr>
-          <w:rFonts w:ascii="Times New Roman" w:hAnsi="Times New Roman" w:eastAsia="Times New Roman"/>
-          <w:b/>
-          <w:i w:val="0"/>
-          <w:color w:val="000000"/>
-          <w:sz w:val="28"/>
-        </w:rPr>
-        <w:t>Tuần 12: 16/02/2026 - 22/02/2026</w:t>
-      </w:r>
-    </w:p>
-    <w:p>
-      <w:pPr>
-        <w:spacing w:line="288" w:lineRule="auto"/>
-        <w:ind w:firstLine="567"/>
-        <w:jc w:val="both"/>
-      </w:pPr>
-      <w:r>
-        <w:rPr>
-          <w:rFonts w:ascii="Times New Roman" w:hAnsi="Times New Roman" w:eastAsia="Times New Roman"/>
-          <w:b w:val="0"/>
-          <w:i w:val="0"/>
-          <w:sz w:val="26"/>
-        </w:rPr>
-        <w:t>Công việc thực hiện:</w:t>
-      </w:r>
-    </w:p>
-    <w:p>
-      <w:pPr>
-        <w:pStyle w:val="ListBullet"/>
-        <w:spacing w:line="288" w:lineRule="auto"/>
-        <w:ind w:left="850" w:hanging="283"/>
-      </w:pPr>
-      <w:r>
-        <w:rPr>
-          <w:rFonts w:ascii="Times New Roman" w:hAnsi="Times New Roman" w:eastAsia="Times New Roman"/>
-          <w:b w:val="0"/>
-          <w:i w:val="0"/>
-          <w:sz w:val="26"/>
-        </w:rPr>
-        <w:t>Xử lý feedback đợt 2 từ Customer Review</w:t>
-      </w:r>
-    </w:p>
-    <w:p>
-      <w:pPr>
-        <w:pStyle w:val="ListBullet"/>
-        <w:spacing w:line="288" w:lineRule="auto"/>
-        <w:ind w:left="850" w:hanging="283"/>
-      </w:pPr>
-      <w:r>
-        <w:rPr>
-          <w:rFonts w:ascii="Times New Roman" w:hAnsi="Times New Roman" w:eastAsia="Times New Roman"/>
-          <w:b w:val="0"/>
-          <w:i w:val="0"/>
-          <w:sz w:val="26"/>
-        </w:rPr>
-        <w:t>Tinh chỉnh thiết kế dựa trên góp ý từ khách hàng</w:t>
-      </w:r>
-    </w:p>
-    <w:p>
-      <w:pPr>
-        <w:pStyle w:val="ListBullet"/>
-        <w:spacing w:line="288" w:lineRule="auto"/>
-        <w:ind w:left="850" w:hanging="283"/>
-      </w:pPr>
-      <w:r>
-        <w:rPr>
-          <w:rFonts w:ascii="Times New Roman" w:hAnsi="Times New Roman" w:eastAsia="Times New Roman"/>
-          <w:b w:val="0"/>
-          <w:i w:val="0"/>
-          <w:sz w:val="26"/>
-        </w:rPr>
-        <w:t>Kiểm tra cross-reference giữa các documents: DB ↔ API, Screen ↔ API</w:t>
-      </w:r>
-    </w:p>
-    <w:p>
-      <w:pPr>
-        <w:pStyle w:val="ListBullet"/>
-        <w:spacing w:line="288" w:lineRule="auto"/>
-        <w:ind w:left="850" w:hanging="283"/>
-      </w:pPr>
-      <w:r>
-        <w:rPr>
-          <w:rFonts w:ascii="Times New Roman" w:hAnsi="Times New Roman" w:eastAsia="Times New Roman"/>
-          <w:b w:val="0"/>
-          <w:i w:val="0"/>
-          <w:sz w:val="26"/>
-        </w:rPr>
-        <w:t>Bắt đầu viết báo cáo thực tập</w:t>
-      </w:r>
-    </w:p>
-    <w:p>
-      <w:pPr>
-        <w:pStyle w:val="ListBullet"/>
-        <w:spacing w:line="288" w:lineRule="auto"/>
-        <w:ind w:left="850" w:hanging="283"/>
-      </w:pPr>
-      <w:r>
-        <w:rPr>
-          <w:rFonts w:ascii="Times New Roman" w:hAnsi="Times New Roman" w:eastAsia="Times New Roman"/>
-          <w:b w:val="0"/>
-          <w:i w:val="0"/>
-          <w:sz w:val="26"/>
-        </w:rPr>
-        <w:t>Chuẩn bị tài liệu tổng hợp: ERD, API spec, Batch flow diagram</w:t>
-      </w:r>
-    </w:p>
-    <w:p>
-      <w:pPr>
-        <w:spacing w:line="288" w:lineRule="auto"/>
-        <w:ind w:firstLine="567"/>
-        <w:jc w:val="both"/>
-      </w:pPr>
-      <w:r>
-        <w:rPr>
-          <w:rFonts w:ascii="Times New Roman" w:hAnsi="Times New Roman" w:eastAsia="Times New Roman"/>
-          <w:b w:val="0"/>
-          <w:i w:val="0"/>
-          <w:sz w:val="26"/>
-        </w:rPr>
-        <w:t>Kỹ năng học được:</w:t>
-      </w:r>
-    </w:p>
-    <w:p>
-      <w:pPr>
-        <w:pStyle w:val="ListBullet"/>
-        <w:spacing w:line="288" w:lineRule="auto"/>
-        <w:ind w:left="850" w:hanging="283"/>
-      </w:pPr>
-      <w:r>
-        <w:rPr>
-          <w:rFonts w:ascii="Times New Roman" w:hAnsi="Times New Roman" w:eastAsia="Times New Roman"/>
-          <w:b w:val="0"/>
-          <w:i w:val="0"/>
-          <w:sz w:val="26"/>
-        </w:rPr>
-        <w:t>Kỹ năng communication với khách hàng qua tài liệu thiết kế</w:t>
-      </w:r>
-    </w:p>
-    <w:p>
-      <w:pPr>
-        <w:pStyle w:val="ListBullet"/>
-        <w:spacing w:line="288" w:lineRule="auto"/>
-        <w:ind w:left="850" w:hanging="283"/>
-      </w:pPr>
-      <w:r>
-        <w:rPr>
-          <w:rFonts w:ascii="Times New Roman" w:hAnsi="Times New Roman" w:eastAsia="Times New Roman"/>
-          <w:b w:val="0"/>
-          <w:i w:val="0"/>
-          <w:sz w:val="26"/>
-        </w:rPr>
-        <w:t>Hiểu tầm quan trọng của cross-reference checking</w:t>
-      </w:r>
-    </w:p>
-    <w:p>
-      <w:pPr>
-        <w:pStyle w:val="ListBullet"/>
-        <w:spacing w:line="288" w:lineRule="auto"/>
-        <w:ind w:left="850" w:hanging="283"/>
-      </w:pPr>
-      <w:r>
-        <w:rPr>
-          <w:rFonts w:ascii="Times New Roman" w:hAnsi="Times New Roman" w:eastAsia="Times New Roman"/>
-          <w:b w:val="0"/>
-          <w:i w:val="0"/>
-          <w:sz w:val="26"/>
-        </w:rPr>
-        <w:t>Biết cách viết báo cáo kỹ thuật theo chuẩn học thuật</w:t>
-      </w:r>
-    </w:p>
-    <w:p>
-      <w:pPr>
-        <w:spacing w:line="288" w:lineRule="auto"/>
-        <w:ind w:firstLine="567"/>
-        <w:jc w:val="both"/>
-      </w:pPr>
-      <w:r>
-        <w:rPr>
-          <w:rFonts w:ascii="Times New Roman" w:hAnsi="Times New Roman" w:eastAsia="Times New Roman"/>
-          <w:b w:val="0"/>
-          <w:i w:val="0"/>
-          <w:sz w:val="26"/>
-        </w:rPr>
-        <w:t>Thách thức: Customer feedback thường yêu cầu thay đổi nghiệp vụ, cần sửa nhiều phần của thiết kế.</w:t>
-      </w:r>
-    </w:p>
-    <w:p>
-      <w:pPr>
-        <w:spacing w:line="288" w:lineRule="auto"/>
-        <w:ind w:firstLine="567"/>
-        <w:jc w:val="both"/>
-      </w:pPr>
-      <w:r>
-        <w:rPr>
-          <w:rFonts w:ascii="Times New Roman" w:hAnsi="Times New Roman" w:eastAsia="Times New Roman"/>
-          <w:b w:val="0"/>
-          <w:i w:val="0"/>
-          <w:sz w:val="26"/>
-        </w:rPr>
-        <w:t>Kết quả: Hoàn thành xử lý feedback đợt 2, bắt đầu viết báo cáo thực tập.</w:t>
-      </w:r>
-    </w:p>
-    <w:p>
-      <w:pPr>
-        <w:pStyle w:val="Heading3"/>
-      </w:pPr>
-      <w:r>
-        <w:rPr>
-          <w:rFonts w:ascii="Times New Roman" w:hAnsi="Times New Roman" w:eastAsia="Times New Roman"/>
-          <w:b/>
-          <w:i w:val="0"/>
-          <w:color w:val="000000"/>
-          <w:sz w:val="28"/>
-        </w:rPr>
-        <w:t>Tuần 13: 23/02/2026 - 01/03/2026</w:t>
-      </w:r>
-    </w:p>
-    <w:p>
-      <w:pPr>
-        <w:spacing w:line="288" w:lineRule="auto"/>
-        <w:ind w:firstLine="567"/>
-        <w:jc w:val="both"/>
-      </w:pPr>
-      <w:r>
-        <w:rPr>
-          <w:rFonts w:ascii="Times New Roman" w:hAnsi="Times New Roman" w:eastAsia="Times New Roman"/>
-          <w:b w:val="0"/>
-          <w:i w:val="0"/>
-          <w:sz w:val="26"/>
-        </w:rPr>
-        <w:t>Công việc thực hiện:</w:t>
-      </w:r>
-    </w:p>
-    <w:p>
-      <w:pPr>
-        <w:pStyle w:val="ListBullet"/>
-        <w:spacing w:line="288" w:lineRule="auto"/>
-        <w:ind w:left="850" w:hanging="283"/>
-      </w:pPr>
-      <w:r>
-        <w:rPr>
-          <w:rFonts w:ascii="Times New Roman" w:hAnsi="Times New Roman" w:eastAsia="Times New Roman"/>
-          <w:b w:val="0"/>
-          <w:i w:val="0"/>
-          <w:sz w:val="26"/>
-        </w:rPr>
-        <w:t>Hoàn thiện tất cả tài liệu thiết kế: DB, Screen, API, Batch</w:t>
-      </w:r>
-    </w:p>
-    <w:p>
-      <w:pPr>
-        <w:pStyle w:val="ListBullet"/>
-        <w:spacing w:line="288" w:lineRule="auto"/>
-        <w:ind w:left="850" w:hanging="283"/>
-      </w:pPr>
-      <w:r>
-        <w:rPr>
-          <w:rFonts w:ascii="Times New Roman" w:hAnsi="Times New Roman" w:eastAsia="Times New Roman"/>
-          <w:b w:val="0"/>
-          <w:i w:val="0"/>
-          <w:sz w:val="26"/>
-        </w:rPr>
-        <w:t>Tạo tài liệu tổng hợp: System Architecture Diagram, Database ERD, API Documentation</w:t>
-      </w:r>
-    </w:p>
-    <w:p>
-      <w:pPr>
-        <w:pStyle w:val="ListBullet"/>
-        <w:spacing w:line="288" w:lineRule="auto"/>
-        <w:ind w:left="850" w:hanging="283"/>
-      </w:pPr>
-      <w:r>
-        <w:rPr>
-          <w:rFonts w:ascii="Times New Roman" w:hAnsi="Times New Roman" w:eastAsia="Times New Roman"/>
-          <w:b w:val="0"/>
-          <w:i w:val="0"/>
-          <w:sz w:val="26"/>
-        </w:rPr>
-        <w:t>Viết hoàn chỉnh báo cáo thực tập theo chuẩn UTC</w:t>
-      </w:r>
-    </w:p>
-    <w:p>
-      <w:pPr>
-        <w:pStyle w:val="ListBullet"/>
-        <w:spacing w:line="288" w:lineRule="auto"/>
-        <w:ind w:left="850" w:hanging="283"/>
-      </w:pPr>
-      <w:r>
-        <w:rPr>
-          <w:rFonts w:ascii="Times New Roman" w:hAnsi="Times New Roman" w:eastAsia="Times New Roman"/>
-          <w:b w:val="0"/>
-          <w:i w:val="0"/>
-          <w:sz w:val="26"/>
-        </w:rPr>
-        <w:t>Chuẩn bị slide thuyết trình kết quả thực tập</w:t>
-      </w:r>
-    </w:p>
-    <w:p>
-      <w:pPr>
-        <w:pStyle w:val="ListBullet"/>
-        <w:spacing w:line="288" w:lineRule="auto"/>
-        <w:ind w:left="850" w:hanging="283"/>
-      </w:pPr>
-      <w:r>
-        <w:rPr>
-          <w:rFonts w:ascii="Times New Roman" w:hAnsi="Times New Roman" w:eastAsia="Times New Roman"/>
-          <w:b w:val="0"/>
-          <w:i w:val="0"/>
-          <w:sz w:val="26"/>
-        </w:rPr>
-        <w:t>Nộp sản phẩm cuối cùng và nhận feedback tích cực từ mentor</w:t>
-      </w:r>
-    </w:p>
-    <w:p>
-      <w:pPr>
-        <w:spacing w:line="288" w:lineRule="auto"/>
-        <w:ind w:firstLine="567"/>
-        <w:jc w:val="both"/>
-      </w:pPr>
-      <w:r>
-        <w:rPr>
-          <w:rFonts w:ascii="Times New Roman" w:hAnsi="Times New Roman" w:eastAsia="Times New Roman"/>
-          <w:b w:val="0"/>
-          <w:i w:val="0"/>
-          <w:sz w:val="26"/>
-        </w:rPr>
-        <w:t>Kỹ năng học được:</w:t>
-      </w:r>
-    </w:p>
-    <w:p>
-      <w:pPr>
-        <w:pStyle w:val="ListBullet"/>
-        <w:spacing w:line="288" w:lineRule="auto"/>
-        <w:ind w:left="850" w:hanging="283"/>
-      </w:pPr>
-      <w:r>
-        <w:rPr>
-          <w:rFonts w:ascii="Times New Roman" w:hAnsi="Times New Roman" w:eastAsia="Times New Roman"/>
-          <w:b w:val="0"/>
-          <w:i w:val="0"/>
-          <w:sz w:val="26"/>
-        </w:rPr>
-        <w:t>Kỹ năng tổng hợp và trình bày kết quả công việc</w:t>
-      </w:r>
-    </w:p>
-    <w:p>
-      <w:pPr>
-        <w:pStyle w:val="ListBullet"/>
-        <w:spacing w:line="288" w:lineRule="auto"/>
-        <w:ind w:left="850" w:hanging="283"/>
-      </w:pPr>
-      <w:r>
-        <w:rPr>
-          <w:rFonts w:ascii="Times New Roman" w:hAnsi="Times New Roman" w:eastAsia="Times New Roman"/>
-          <w:b w:val="0"/>
-          <w:i w:val="0"/>
-          <w:sz w:val="26"/>
-        </w:rPr>
-        <w:t>Khả năng viết báo cáo kỹ thuật chuyên nghiệp</w:t>
-      </w:r>
-    </w:p>
-    <w:p>
-      <w:pPr>
-        <w:pStyle w:val="ListBullet"/>
-        <w:spacing w:line="288" w:lineRule="auto"/>
-        <w:ind w:left="850" w:hanging="283"/>
-      </w:pPr>
-      <w:r>
-        <w:rPr>
-          <w:rFonts w:ascii="Times New Roman" w:hAnsi="Times New Roman" w:eastAsia="Times New Roman"/>
-          <w:b w:val="0"/>
-          <w:i w:val="0"/>
-          <w:sz w:val="26"/>
-        </w:rPr>
-        <w:t>Kỹ năng thuyết trình và communication</w:t>
-      </w:r>
-    </w:p>
-    <w:p>
-      <w:pPr>
-        <w:spacing w:line="288" w:lineRule="auto"/>
-        <w:ind w:firstLine="567"/>
-        <w:jc w:val="both"/>
-      </w:pPr>
-      <w:r>
-        <w:rPr>
-          <w:rFonts w:ascii="Times New Roman" w:hAnsi="Times New Roman" w:eastAsia="Times New Roman"/>
-          <w:b w:val="0"/>
-          <w:i w:val="0"/>
-          <w:sz w:val="26"/>
-        </w:rPr>
-        <w:t>Thách thức: Deadline gấp, cần quản lý thời gian hiệu quả để hoàn thành đầy đủ các deliverables.</w:t>
-      </w:r>
-    </w:p>
-    <w:p>
-      <w:pPr>
-        <w:spacing w:line="288" w:lineRule="auto"/>
-        <w:ind w:firstLine="567"/>
-        <w:jc w:val="both"/>
-      </w:pPr>
-      <w:r>
-        <w:rPr>
-          <w:rFonts w:ascii="Times New Roman" w:hAnsi="Times New Roman" w:eastAsia="Times New Roman"/>
-          <w:b w:val="0"/>
-          <w:i w:val="0"/>
-          <w:sz w:val="26"/>
-        </w:rPr>
-        <w:t>Kết quả: Hoàn thành đầy đủ tất cả sản phẩm thực tập, nhận được đánh giá cao từ mentor và công ty. Sẵn sàng áp dụng kiến thức vào đồ án tốt nghiệp.</w:t>
-      </w:r>
-    </w:p>
+    <w:tbl>
+      <w:tblPr>
+        <w:tblStyle w:val="TableGrid"/>
+        <w:tblW w:type="auto" w:w="0"/>
+        <w:tblLook w:firstColumn="1" w:firstRow="1" w:lastColumn="0" w:lastRow="0" w:noHBand="0" w:noVBand="1" w:val="04A0"/>
+      </w:tblPr>
+      <w:tblGrid>
+        <w:gridCol w:w="680"/>
+        <w:gridCol w:w="1984"/>
+        <w:gridCol w:w="3685"/>
+        <w:gridCol w:w="3005"/>
+      </w:tblGrid>
+      <w:tr>
+        <w:tc>
+          <w:tcPr>
+            <w:tcW w:type="dxa" w:w="2160"/>
+            <w:shd w:fill="D9D9D9"/>
+            <w:vAlign w:val="center"/>
+          </w:tcPr>
+          <w:p>
+            <w:pPr>
+              <w:jc w:val="center"/>
+            </w:pPr>
+            <w:r>
+              <w:rPr>
+                <w:rFonts w:ascii="Times New Roman" w:hAnsi="Times New Roman"/>
+                <w:b/>
+                <w:sz w:val="24"/>
+              </w:rPr>
+              <w:t>Tuần</w:t>
+            </w:r>
+          </w:p>
+        </w:tc>
+        <w:tc>
+          <w:tcPr>
+            <w:tcW w:type="dxa" w:w="2160"/>
+            <w:shd w:fill="D9D9D9"/>
+            <w:vAlign w:val="center"/>
+          </w:tcPr>
+          <w:p>
+            <w:pPr>
+              <w:jc w:val="center"/>
+            </w:pPr>
+            <w:r>
+              <w:rPr>
+                <w:rFonts w:ascii="Times New Roman" w:hAnsi="Times New Roman"/>
+                <w:b/>
+                <w:sz w:val="24"/>
+              </w:rPr>
+              <w:t>Thời gian</w:t>
+            </w:r>
+          </w:p>
+        </w:tc>
+        <w:tc>
+          <w:tcPr>
+            <w:tcW w:type="dxa" w:w="2160"/>
+            <w:shd w:fill="D9D9D9"/>
+            <w:vAlign w:val="center"/>
+          </w:tcPr>
+          <w:p>
+            <w:pPr>
+              <w:jc w:val="center"/>
+            </w:pPr>
+            <w:r>
+              <w:rPr>
+                <w:rFonts w:ascii="Times New Roman" w:hAnsi="Times New Roman"/>
+                <w:b/>
+                <w:sz w:val="24"/>
+              </w:rPr>
+              <w:t>Nội dung công việc</w:t>
+            </w:r>
+          </w:p>
+        </w:tc>
+        <w:tc>
+          <w:tcPr>
+            <w:tcW w:type="dxa" w:w="2160"/>
+            <w:shd w:fill="D9D9D9"/>
+            <w:vAlign w:val="center"/>
+          </w:tcPr>
+          <w:p>
+            <w:pPr>
+              <w:jc w:val="center"/>
+            </w:pPr>
+            <w:r>
+              <w:rPr>
+                <w:rFonts w:ascii="Times New Roman" w:hAnsi="Times New Roman"/>
+                <w:b/>
+                <w:sz w:val="24"/>
+              </w:rPr>
+              <w:t>Kỹ năng &amp; Kết quả</w:t>
+            </w:r>
+          </w:p>
+        </w:tc>
+      </w:tr>
+      <w:tr>
+        <w:tc>
+          <w:tcPr>
+            <w:tcW w:type="dxa" w:w="2160"/>
+            <w:vAlign w:val="center"/>
+          </w:tcPr>
+          <w:p>
+            <w:pPr>
+              <w:spacing w:line="276" w:lineRule="auto"/>
+              <w:jc w:val="center"/>
+            </w:pPr>
+            <w:r>
+              <w:rPr>
+                <w:rFonts w:ascii="Times New Roman" w:hAnsi="Times New Roman"/>
+                <w:sz w:val="24"/>
+              </w:rPr>
+              <w:t>1</w:t>
+            </w:r>
+          </w:p>
+        </w:tc>
+        <w:tc>
+          <w:tcPr>
+            <w:tcW w:type="dxa" w:w="2160"/>
+            <w:vAlign w:val="center"/>
+          </w:tcPr>
+          <w:p>
+            <w:pPr>
+              <w:spacing w:line="276" w:lineRule="auto"/>
+              <w:jc w:val="center"/>
+            </w:pPr>
+            <w:r>
+              <w:rPr>
+                <w:rFonts w:ascii="Times New Roman" w:hAnsi="Times New Roman"/>
+                <w:sz w:val="24"/>
+              </w:rPr>
+              <w:t>01/12 – 07/12/2025</w:t>
+            </w:r>
+          </w:p>
+        </w:tc>
+        <w:tc>
+          <w:tcPr>
+            <w:tcW w:type="dxa" w:w="2160"/>
+            <w:vAlign w:val="top"/>
+          </w:tcPr>
+          <w:p>
+            <w:pPr>
+              <w:spacing w:line="276" w:lineRule="auto"/>
+              <w:jc w:val="both"/>
+            </w:pPr>
+            <w:r>
+              <w:rPr>
+                <w:rFonts w:ascii="Times New Roman" w:hAnsi="Times New Roman"/>
+                <w:sz w:val="24"/>
+              </w:rPr>
+              <w:t>Onboarding, tìm hiểu dự án SORA STEP4, quy trình làm việc, công cụ (Git, IntelliJ, Oracle SQL Developer), ôn tập Java/Spring Boot/Oracle Database, đọc Business Requirement Document</w:t>
+            </w:r>
+          </w:p>
+        </w:tc>
+        <w:tc>
+          <w:tcPr>
+            <w:tcW w:type="dxa" w:w="2160"/>
+            <w:vAlign w:val="top"/>
+          </w:tcPr>
+          <w:p>
+            <w:pPr>
+              <w:spacing w:line="276" w:lineRule="auto"/>
+              <w:jc w:val="both"/>
+            </w:pPr>
+            <w:r>
+              <w:rPr>
+                <w:rFonts w:ascii="Times New Roman" w:hAnsi="Times New Roman"/>
+                <w:sz w:val="24"/>
+              </w:rPr>
+              <w:t>Hiểu quy trình phát triển offshore theo chuẩn Nhật Bản, cấu trúc tổ chức dự án, công cụ quản lý. Hoàn thành onboarding, nắm overview dự án</w:t>
+            </w:r>
+          </w:p>
+        </w:tc>
+      </w:tr>
+      <w:tr>
+        <w:tc>
+          <w:tcPr>
+            <w:tcW w:type="dxa" w:w="2160"/>
+            <w:vAlign w:val="center"/>
+          </w:tcPr>
+          <w:p>
+            <w:pPr>
+              <w:spacing w:line="276" w:lineRule="auto"/>
+              <w:jc w:val="center"/>
+            </w:pPr>
+            <w:r>
+              <w:rPr>
+                <w:rFonts w:ascii="Times New Roman" w:hAnsi="Times New Roman"/>
+                <w:sz w:val="24"/>
+              </w:rPr>
+              <w:t>2</w:t>
+            </w:r>
+          </w:p>
+        </w:tc>
+        <w:tc>
+          <w:tcPr>
+            <w:tcW w:type="dxa" w:w="2160"/>
+            <w:vAlign w:val="center"/>
+          </w:tcPr>
+          <w:p>
+            <w:pPr>
+              <w:spacing w:line="276" w:lineRule="auto"/>
+              <w:jc w:val="center"/>
+            </w:pPr>
+            <w:r>
+              <w:rPr>
+                <w:rFonts w:ascii="Times New Roman" w:hAnsi="Times New Roman"/>
+                <w:sz w:val="24"/>
+              </w:rPr>
+              <w:t>08/12 – 14/12/2025</w:t>
+            </w:r>
+          </w:p>
+        </w:tc>
+        <w:tc>
+          <w:tcPr>
+            <w:tcW w:type="dxa" w:w="2160"/>
+            <w:vAlign w:val="top"/>
+          </w:tcPr>
+          <w:p>
+            <w:pPr>
+              <w:spacing w:line="276" w:lineRule="auto"/>
+              <w:jc w:val="both"/>
+            </w:pPr>
+            <w:r>
+              <w:rPr>
+                <w:rFonts w:ascii="Times New Roman" w:hAnsi="Times New Roman"/>
+                <w:sz w:val="24"/>
+              </w:rPr>
+              <w:t>Training Database Design, học Oracle Database (data types, constraints, indexes), naming convention, nghiên cứu cấu trúc DB SORA, đọc ERD</w:t>
+            </w:r>
+          </w:p>
+        </w:tc>
+        <w:tc>
+          <w:tcPr>
+            <w:tcW w:type="dxa" w:w="2160"/>
+            <w:vAlign w:val="top"/>
+          </w:tcPr>
+          <w:p>
+            <w:pPr>
+              <w:spacing w:line="276" w:lineRule="auto"/>
+              <w:jc w:val="both"/>
+            </w:pPr>
+            <w:r>
+              <w:rPr>
+                <w:rFonts w:ascii="Times New Roman" w:hAnsi="Times New Roman"/>
+                <w:sz w:val="24"/>
+              </w:rPr>
+              <w:t>Nắm vững kiểu dữ liệu Oracle (VARCHAR2, NUMBER, DATE, CLOB, BLOB), constraints (PK, FK, NOT NULL, UNIQUE, CHECK), indexes (B-tree, Bitmap, Function-based). Hoàn thành training DB Design</w:t>
+            </w:r>
+          </w:p>
+        </w:tc>
+      </w:tr>
+      <w:tr>
+        <w:tc>
+          <w:tcPr>
+            <w:tcW w:type="dxa" w:w="2160"/>
+            <w:vAlign w:val="center"/>
+          </w:tcPr>
+          <w:p>
+            <w:pPr>
+              <w:spacing w:line="276" w:lineRule="auto"/>
+              <w:jc w:val="center"/>
+            </w:pPr>
+            <w:r>
+              <w:rPr>
+                <w:rFonts w:ascii="Times New Roman" w:hAnsi="Times New Roman"/>
+                <w:sz w:val="24"/>
+              </w:rPr>
+              <w:t>3</w:t>
+            </w:r>
+          </w:p>
+        </w:tc>
+        <w:tc>
+          <w:tcPr>
+            <w:tcW w:type="dxa" w:w="2160"/>
+            <w:vAlign w:val="center"/>
+          </w:tcPr>
+          <w:p>
+            <w:pPr>
+              <w:spacing w:line="276" w:lineRule="auto"/>
+              <w:jc w:val="center"/>
+            </w:pPr>
+            <w:r>
+              <w:rPr>
+                <w:rFonts w:ascii="Times New Roman" w:hAnsi="Times New Roman"/>
+                <w:sz w:val="24"/>
+              </w:rPr>
+              <w:t>15/12 – 21/12/2025</w:t>
+            </w:r>
+          </w:p>
+        </w:tc>
+        <w:tc>
+          <w:tcPr>
+            <w:tcW w:type="dxa" w:w="2160"/>
+            <w:vAlign w:val="top"/>
+          </w:tcPr>
+          <w:p>
+            <w:pPr>
+              <w:spacing w:line="276" w:lineRule="auto"/>
+              <w:jc w:val="both"/>
+            </w:pPr>
+            <w:r>
+              <w:rPr>
+                <w:rFonts w:ascii="Times New Roman" w:hAnsi="Times New Roman"/>
+                <w:sz w:val="24"/>
+              </w:rPr>
+              <w:t>Thiết kế bảng cho module User Management, định nghĩa columns (data type, length, constraints), tạo Entity Info và Column Info documents, review với mentor và xử lý feedback đợt 1</w:t>
+            </w:r>
+          </w:p>
+        </w:tc>
+        <w:tc>
+          <w:tcPr>
+            <w:tcW w:type="dxa" w:w="2160"/>
+            <w:vAlign w:val="top"/>
+          </w:tcPr>
+          <w:p>
+            <w:pPr>
+              <w:spacing w:line="276" w:lineRule="auto"/>
+              <w:jc w:val="both"/>
+            </w:pPr>
+            <w:r>
+              <w:rPr>
+                <w:rFonts w:ascii="Times New Roman" w:hAnsi="Times New Roman"/>
+                <w:sz w:val="24"/>
+              </w:rPr>
+              <w:t>Phân tích yêu cầu nghiệp vụ xác định entities/relationships, áp dụng normalization (1NF, 2NF, 3NF), viết tài liệu thiết kế DB theo chuẩn. Hoàn thành thiết kế 5 bảng, pass review sau 1 lần sửa</w:t>
+            </w:r>
+          </w:p>
+        </w:tc>
+      </w:tr>
+      <w:tr>
+        <w:tc>
+          <w:tcPr>
+            <w:tcW w:type="dxa" w:w="2160"/>
+            <w:vAlign w:val="center"/>
+          </w:tcPr>
+          <w:p>
+            <w:pPr>
+              <w:spacing w:line="276" w:lineRule="auto"/>
+              <w:jc w:val="center"/>
+            </w:pPr>
+            <w:r>
+              <w:rPr>
+                <w:rFonts w:ascii="Times New Roman" w:hAnsi="Times New Roman"/>
+                <w:sz w:val="24"/>
+              </w:rPr>
+              <w:t>4</w:t>
+            </w:r>
+          </w:p>
+        </w:tc>
+        <w:tc>
+          <w:tcPr>
+            <w:tcW w:type="dxa" w:w="2160"/>
+            <w:vAlign w:val="center"/>
+          </w:tcPr>
+          <w:p>
+            <w:pPr>
+              <w:spacing w:line="276" w:lineRule="auto"/>
+              <w:jc w:val="center"/>
+            </w:pPr>
+            <w:r>
+              <w:rPr>
+                <w:rFonts w:ascii="Times New Roman" w:hAnsi="Times New Roman"/>
+                <w:sz w:val="24"/>
+              </w:rPr>
+              <w:t>22/12 – 28/12/2025</w:t>
+            </w:r>
+          </w:p>
+        </w:tc>
+        <w:tc>
+          <w:tcPr>
+            <w:tcW w:type="dxa" w:w="2160"/>
+            <w:vAlign w:val="top"/>
+          </w:tcPr>
+          <w:p>
+            <w:pPr>
+              <w:spacing w:line="276" w:lineRule="auto"/>
+              <w:jc w:val="both"/>
+            </w:pPr>
+            <w:r>
+              <w:rPr>
+                <w:rFonts w:ascii="Times New Roman" w:hAnsi="Times New Roman"/>
+                <w:sz w:val="24"/>
+              </w:rPr>
+              <w:t>Thiết kế indexes, tạo Index Info document (loại index, columns, mục đích), học query optimization và EXPLAIN PLAN, training Screen Design, tìm hiểu wireframe và UI/UX principles</w:t>
+            </w:r>
+          </w:p>
+        </w:tc>
+        <w:tc>
+          <w:tcPr>
+            <w:tcW w:type="dxa" w:w="2160"/>
+            <w:vAlign w:val="top"/>
+          </w:tcPr>
+          <w:p>
+            <w:pPr>
+              <w:spacing w:line="276" w:lineRule="auto"/>
+              <w:jc w:val="both"/>
+            </w:pPr>
+            <w:r>
+              <w:rPr>
+                <w:rFonts w:ascii="Times New Roman" w:hAnsi="Times New Roman"/>
+                <w:sz w:val="24"/>
+              </w:rPr>
+              <w:t>Hiểu khi nào tạo index và loại phù hợp (B-tree vs Bitmap), analyze query performance, quy trình thiết kế màn hình từ wireframe đến detailed design. Hoàn thành Index Info cho tất cả bảng</w:t>
+            </w:r>
+          </w:p>
+        </w:tc>
+      </w:tr>
+      <w:tr>
+        <w:tc>
+          <w:tcPr>
+            <w:tcW w:type="dxa" w:w="2160"/>
+            <w:vAlign w:val="center"/>
+          </w:tcPr>
+          <w:p>
+            <w:pPr>
+              <w:spacing w:line="276" w:lineRule="auto"/>
+              <w:jc w:val="center"/>
+            </w:pPr>
+            <w:r>
+              <w:rPr>
+                <w:rFonts w:ascii="Times New Roman" w:hAnsi="Times New Roman"/>
+                <w:sz w:val="24"/>
+              </w:rPr>
+              <w:t>5</w:t>
+            </w:r>
+          </w:p>
+        </w:tc>
+        <w:tc>
+          <w:tcPr>
+            <w:tcW w:type="dxa" w:w="2160"/>
+            <w:vAlign w:val="center"/>
+          </w:tcPr>
+          <w:p>
+            <w:pPr>
+              <w:spacing w:line="276" w:lineRule="auto"/>
+              <w:jc w:val="center"/>
+            </w:pPr>
+            <w:r>
+              <w:rPr>
+                <w:rFonts w:ascii="Times New Roman" w:hAnsi="Times New Roman"/>
+                <w:sz w:val="24"/>
+              </w:rPr>
+              <w:t>29/12 – 04/01/2026</w:t>
+            </w:r>
+          </w:p>
+        </w:tc>
+        <w:tc>
+          <w:tcPr>
+            <w:tcW w:type="dxa" w:w="2160"/>
+            <w:vAlign w:val="top"/>
+          </w:tcPr>
+          <w:p>
+            <w:pPr>
+              <w:spacing w:line="276" w:lineRule="auto"/>
+              <w:jc w:val="both"/>
+            </w:pPr>
+            <w:r>
+              <w:rPr>
+                <w:rFonts w:ascii="Times New Roman" w:hAnsi="Times New Roman"/>
+                <w:sz w:val="24"/>
+              </w:rPr>
+              <w:t>Thiết kế màn hình User List, định nghĩa layout (header, search bar, table, pagination, buttons), tạo Items document (ID, tên, loại, I/O type, required flag), validation rules, messages</w:t>
+            </w:r>
+          </w:p>
+        </w:tc>
+        <w:tc>
+          <w:tcPr>
+            <w:tcW w:type="dxa" w:w="2160"/>
+            <w:vAlign w:val="top"/>
+          </w:tcPr>
+          <w:p>
+            <w:pPr>
+              <w:spacing w:line="276" w:lineRule="auto"/>
+              <w:jc w:val="both"/>
+            </w:pPr>
+            <w:r>
+              <w:rPr>
+                <w:rFonts w:ascii="Times New Roman" w:hAnsi="Times New Roman"/>
+                <w:sz w:val="24"/>
+              </w:rPr>
+              <w:t>Phân tích màn hình thành components, hiểu validation (client-side vs server-side), viết validation rules đầy đủ edge cases. Hoàn thành thiết kế User List với items, validation, messages</w:t>
+            </w:r>
+          </w:p>
+        </w:tc>
+      </w:tr>
+      <w:tr>
+        <w:tc>
+          <w:tcPr>
+            <w:tcW w:type="dxa" w:w="2160"/>
+            <w:vAlign w:val="center"/>
+          </w:tcPr>
+          <w:p>
+            <w:pPr>
+              <w:spacing w:line="276" w:lineRule="auto"/>
+              <w:jc w:val="center"/>
+            </w:pPr>
+            <w:r>
+              <w:rPr>
+                <w:rFonts w:ascii="Times New Roman" w:hAnsi="Times New Roman"/>
+                <w:sz w:val="24"/>
+              </w:rPr>
+              <w:t>6</w:t>
+            </w:r>
+          </w:p>
+        </w:tc>
+        <w:tc>
+          <w:tcPr>
+            <w:tcW w:type="dxa" w:w="2160"/>
+            <w:vAlign w:val="center"/>
+          </w:tcPr>
+          <w:p>
+            <w:pPr>
+              <w:spacing w:line="276" w:lineRule="auto"/>
+              <w:jc w:val="center"/>
+            </w:pPr>
+            <w:r>
+              <w:rPr>
+                <w:rFonts w:ascii="Times New Roman" w:hAnsi="Times New Roman"/>
+                <w:sz w:val="24"/>
+              </w:rPr>
+              <w:t>05/01 – 11/01/2026</w:t>
+            </w:r>
+          </w:p>
+        </w:tc>
+        <w:tc>
+          <w:tcPr>
+            <w:tcW w:type="dxa" w:w="2160"/>
+            <w:vAlign w:val="top"/>
+          </w:tcPr>
+          <w:p>
+            <w:pPr>
+              <w:spacing w:line="276" w:lineRule="auto"/>
+              <w:jc w:val="both"/>
+            </w:pPr>
+            <w:r>
+              <w:rPr>
+                <w:rFonts w:ascii="Times New Roman" w:hAnsi="Times New Roman"/>
+                <w:sz w:val="24"/>
+              </w:rPr>
+              <w:t>Thiết kế màn hình User Detail, correlation validation (logic phụ thuộc giữa trường), Item Control document (hiển thị/ẩn, enable/disable fields), training RESTful API (HTTP methods, status codes, request/response)</w:t>
+            </w:r>
+          </w:p>
+        </w:tc>
+        <w:tc>
+          <w:tcPr>
+            <w:tcW w:type="dxa" w:w="2160"/>
+            <w:vAlign w:val="top"/>
+          </w:tcPr>
+          <w:p>
+            <w:pPr>
+              <w:spacing w:line="276" w:lineRule="auto"/>
+              <w:jc w:val="both"/>
+            </w:pPr>
+            <w:r>
+              <w:rPr>
+                <w:rFonts w:ascii="Times New Roman" w:hAnsi="Times New Roman"/>
+                <w:sz w:val="24"/>
+              </w:rPr>
+              <w:t>Thiết kế validation phức tạp multiple conditions, state management (view vs edit mode), nguyên tắc RESTful API. Hoàn thành thiết kế User Detail, sẵn sàng API Design</w:t>
+            </w:r>
+          </w:p>
+        </w:tc>
+      </w:tr>
+      <w:tr>
+        <w:tc>
+          <w:tcPr>
+            <w:tcW w:type="dxa" w:w="2160"/>
+            <w:vAlign w:val="center"/>
+          </w:tcPr>
+          <w:p>
+            <w:pPr>
+              <w:spacing w:line="276" w:lineRule="auto"/>
+              <w:jc w:val="center"/>
+            </w:pPr>
+            <w:r>
+              <w:rPr>
+                <w:rFonts w:ascii="Times New Roman" w:hAnsi="Times New Roman"/>
+                <w:sz w:val="24"/>
+              </w:rPr>
+              <w:t>7</w:t>
+            </w:r>
+          </w:p>
+        </w:tc>
+        <w:tc>
+          <w:tcPr>
+            <w:tcW w:type="dxa" w:w="2160"/>
+            <w:vAlign w:val="center"/>
+          </w:tcPr>
+          <w:p>
+            <w:pPr>
+              <w:spacing w:line="276" w:lineRule="auto"/>
+              <w:jc w:val="center"/>
+            </w:pPr>
+            <w:r>
+              <w:rPr>
+                <w:rFonts w:ascii="Times New Roman" w:hAnsi="Times New Roman"/>
+                <w:sz w:val="24"/>
+              </w:rPr>
+              <w:t>12/01 – 18/01/2026</w:t>
+            </w:r>
+          </w:p>
+        </w:tc>
+        <w:tc>
+          <w:tcPr>
+            <w:tcW w:type="dxa" w:w="2160"/>
+            <w:vAlign w:val="top"/>
+          </w:tcPr>
+          <w:p>
+            <w:pPr>
+              <w:spacing w:line="276" w:lineRule="auto"/>
+              <w:jc w:val="both"/>
+            </w:pPr>
+            <w:r>
+              <w:rPr>
+                <w:rFonts w:ascii="Times New Roman" w:hAnsi="Times New Roman"/>
+                <w:sz w:val="24"/>
+              </w:rPr>
+              <w:t>Thiết kế API cho User Management (GET/POST/PUT/DELETE /users), Request Parameters (query/path params, body), Response structure (status, data, message, pagination), Error Handling (400/401/403/404/500), giới thiệu Claude AI [4] để review thiết kế</w:t>
+            </w:r>
+          </w:p>
+        </w:tc>
+        <w:tc>
+          <w:tcPr>
+            <w:tcW w:type="dxa" w:w="2160"/>
+            <w:vAlign w:val="top"/>
+          </w:tcPr>
+          <w:p>
+            <w:pPr>
+              <w:spacing w:line="276" w:lineRule="auto"/>
+              <w:jc w:val="both"/>
+            </w:pPr>
+            <w:r>
+              <w:rPr>
+                <w:rFonts w:ascii="Times New Roman" w:hAnsi="Times New Roman"/>
+                <w:sz w:val="24"/>
+              </w:rPr>
+              <w:t>Thiết kế RESTful API resource-based, hiểu idempotency (GET, PUT, DELETE), sử dụng AI tools review và cải thiện. Hoàn thành 5 APIs chính với đầy đủ request/response specs</w:t>
+            </w:r>
+          </w:p>
+        </w:tc>
+      </w:tr>
+      <w:tr>
+        <w:tc>
+          <w:tcPr>
+            <w:tcW w:type="dxa" w:w="2160"/>
+            <w:vAlign w:val="center"/>
+          </w:tcPr>
+          <w:p>
+            <w:pPr>
+              <w:spacing w:line="276" w:lineRule="auto"/>
+              <w:jc w:val="center"/>
+            </w:pPr>
+            <w:r>
+              <w:rPr>
+                <w:rFonts w:ascii="Times New Roman" w:hAnsi="Times New Roman"/>
+                <w:sz w:val="24"/>
+              </w:rPr>
+              <w:t>8</w:t>
+            </w:r>
+          </w:p>
+        </w:tc>
+        <w:tc>
+          <w:tcPr>
+            <w:tcW w:type="dxa" w:w="2160"/>
+            <w:vAlign w:val="center"/>
+          </w:tcPr>
+          <w:p>
+            <w:pPr>
+              <w:spacing w:line="276" w:lineRule="auto"/>
+              <w:jc w:val="center"/>
+            </w:pPr>
+            <w:r>
+              <w:rPr>
+                <w:rFonts w:ascii="Times New Roman" w:hAnsi="Times New Roman"/>
+                <w:sz w:val="24"/>
+              </w:rPr>
+              <w:t>19/01 – 25/01/2026</w:t>
+            </w:r>
+          </w:p>
+        </w:tc>
+        <w:tc>
+          <w:tcPr>
+            <w:tcW w:type="dxa" w:w="2160"/>
+            <w:vAlign w:val="top"/>
+          </w:tcPr>
+          <w:p>
+            <w:pPr>
+              <w:spacing w:line="276" w:lineRule="auto"/>
+              <w:jc w:val="both"/>
+            </w:pPr>
+            <w:r>
+              <w:rPr>
+                <w:rFonts w:ascii="Times New Roman" w:hAnsi="Times New Roman"/>
+                <w:sz w:val="24"/>
+              </w:rPr>
+              <w:t>Thiết kế APIs cho Course Management, sử dụng Claude AI kiểm tra chất lượng, fix issues (naming inconsistency, missing error cases, incomplete docs), training Spring Batch (Job, Step, ItemReader, ItemProcessor, ItemWriter)</w:t>
+            </w:r>
+          </w:p>
+        </w:tc>
+        <w:tc>
+          <w:tcPr>
+            <w:tcW w:type="dxa" w:w="2160"/>
+            <w:vAlign w:val="top"/>
+          </w:tcPr>
+          <w:p>
+            <w:pPr>
+              <w:spacing w:line="276" w:lineRule="auto"/>
+              <w:jc w:val="both"/>
+            </w:pPr>
+            <w:r>
+              <w:rPr>
+                <w:rFonts w:ascii="Times New Roman" w:hAnsi="Times New Roman"/>
+                <w:sz w:val="24"/>
+              </w:rPr>
+              <w:t>Viết API documentation rõ ràng đầy đủ, hiểu chunk processing, integrate AI vào workflow nâng cao chất lượng. Hoàn thành APIs cho Course Management, hiểu cơ bản Spring Batch</w:t>
+            </w:r>
+          </w:p>
+        </w:tc>
+      </w:tr>
+      <w:tr>
+        <w:tc>
+          <w:tcPr>
+            <w:tcW w:type="dxa" w:w="2160"/>
+            <w:vAlign w:val="center"/>
+          </w:tcPr>
+          <w:p>
+            <w:pPr>
+              <w:spacing w:line="276" w:lineRule="auto"/>
+              <w:jc w:val="center"/>
+            </w:pPr>
+            <w:r>
+              <w:rPr>
+                <w:rFonts w:ascii="Times New Roman" w:hAnsi="Times New Roman"/>
+                <w:sz w:val="24"/>
+              </w:rPr>
+              <w:t>9</w:t>
+            </w:r>
+          </w:p>
+        </w:tc>
+        <w:tc>
+          <w:tcPr>
+            <w:tcW w:type="dxa" w:w="2160"/>
+            <w:vAlign w:val="center"/>
+          </w:tcPr>
+          <w:p>
+            <w:pPr>
+              <w:spacing w:line="276" w:lineRule="auto"/>
+              <w:jc w:val="center"/>
+            </w:pPr>
+            <w:r>
+              <w:rPr>
+                <w:rFonts w:ascii="Times New Roman" w:hAnsi="Times New Roman"/>
+                <w:sz w:val="24"/>
+              </w:rPr>
+              <w:t>26/01 – 01/02/2026</w:t>
+            </w:r>
+          </w:p>
+        </w:tc>
+        <w:tc>
+          <w:tcPr>
+            <w:tcW w:type="dxa" w:w="2160"/>
+            <w:vAlign w:val="top"/>
+          </w:tcPr>
+          <w:p>
+            <w:pPr>
+              <w:spacing w:line="276" w:lineRule="auto"/>
+              <w:jc w:val="both"/>
+            </w:pPr>
+            <w:r>
+              <w:rPr>
+                <w:rFonts w:ascii="Times New Roman" w:hAnsi="Times New Roman"/>
+                <w:sz w:val="24"/>
+              </w:rPr>
+              <w:t>Thiết kế Batch Job Import User từ CSV, Job structure 5 blocks (Chuẩn bị, Khởi tạo, Kiểm tra, Xử lý, Kết thúc), Shell Script (input params, return codes), pseudo code ItemReader/Processor/Writer, SQL queries (SELECT, INSERT, UPDATE)</w:t>
+            </w:r>
+          </w:p>
+        </w:tc>
+        <w:tc>
+          <w:tcPr>
+            <w:tcW w:type="dxa" w:w="2160"/>
+            <w:vAlign w:val="top"/>
+          </w:tcPr>
+          <w:p>
+            <w:pPr>
+              <w:spacing w:line="276" w:lineRule="auto"/>
+              <w:jc w:val="both"/>
+            </w:pPr>
+            <w:r>
+              <w:rPr>
+                <w:rFonts w:ascii="Times New Roman" w:hAnsi="Times New Roman"/>
+                <w:sz w:val="24"/>
+              </w:rPr>
+              <w:t>Phân tích batch requirements chia steps, transaction management trong batch, xử lý error và rollback chunk processing. Hoàn thành thiết kế Batch Job đầu tiên với 5 blocks và SQL</w:t>
+            </w:r>
+          </w:p>
+        </w:tc>
+      </w:tr>
+      <w:tr>
+        <w:tc>
+          <w:tcPr>
+            <w:tcW w:type="dxa" w:w="2160"/>
+            <w:vAlign w:val="center"/>
+          </w:tcPr>
+          <w:p>
+            <w:pPr>
+              <w:spacing w:line="276" w:lineRule="auto"/>
+              <w:jc w:val="center"/>
+            </w:pPr>
+            <w:r>
+              <w:rPr>
+                <w:rFonts w:ascii="Times New Roman" w:hAnsi="Times New Roman"/>
+                <w:sz w:val="24"/>
+              </w:rPr>
+              <w:t>10</w:t>
+            </w:r>
+          </w:p>
+        </w:tc>
+        <w:tc>
+          <w:tcPr>
+            <w:tcW w:type="dxa" w:w="2160"/>
+            <w:vAlign w:val="center"/>
+          </w:tcPr>
+          <w:p>
+            <w:pPr>
+              <w:spacing w:line="276" w:lineRule="auto"/>
+              <w:jc w:val="center"/>
+            </w:pPr>
+            <w:r>
+              <w:rPr>
+                <w:rFonts w:ascii="Times New Roman" w:hAnsi="Times New Roman"/>
+                <w:sz w:val="24"/>
+              </w:rPr>
+              <w:t>02/02 – 08/02/2026</w:t>
+            </w:r>
+          </w:p>
+        </w:tc>
+        <w:tc>
+          <w:tcPr>
+            <w:tcW w:type="dxa" w:w="2160"/>
+            <w:vAlign w:val="top"/>
+          </w:tcPr>
+          <w:p>
+            <w:pPr>
+              <w:spacing w:line="276" w:lineRule="auto"/>
+              <w:jc w:val="both"/>
+            </w:pPr>
+            <w:r>
+              <w:rPr>
+                <w:rFonts w:ascii="Times New Roman" w:hAnsi="Times New Roman"/>
+                <w:sz w:val="24"/>
+              </w:rPr>
+              <w:t>Thiết kế Batch Job Generate Monthly Report, áp dụng chunk processing (size=1000), xử lý feedback (Shiteki) đợt 1 từ Leader Review, fix lỗi (logic sai, thiếu validation, inconsistent naming), refactor đảm bảo nhất quán DB/Screen/API/Batch</w:t>
+            </w:r>
+          </w:p>
+        </w:tc>
+        <w:tc>
+          <w:tcPr>
+            <w:tcW w:type="dxa" w:w="2160"/>
+            <w:vAlign w:val="top"/>
+          </w:tcPr>
+          <w:p>
+            <w:pPr>
+              <w:spacing w:line="276" w:lineRule="auto"/>
+              <w:jc w:val="both"/>
+            </w:pPr>
+            <w:r>
+              <w:rPr>
+                <w:rFonts w:ascii="Times New Roman" w:hAnsi="Times New Roman"/>
+                <w:sz w:val="24"/>
+              </w:rPr>
+              <w:t>Xử lý review feedback có hệ thống, hiểu tầm quan trọng consistency, tự review trước submit. Hoàn thành Batch Job thứ 2, xử lý 80% feedback đợt 1</w:t>
+            </w:r>
+          </w:p>
+        </w:tc>
+      </w:tr>
+      <w:tr>
+        <w:tc>
+          <w:tcPr>
+            <w:tcW w:type="dxa" w:w="2160"/>
+            <w:vAlign w:val="center"/>
+          </w:tcPr>
+          <w:p>
+            <w:pPr>
+              <w:spacing w:line="276" w:lineRule="auto"/>
+              <w:jc w:val="center"/>
+            </w:pPr>
+            <w:r>
+              <w:rPr>
+                <w:rFonts w:ascii="Times New Roman" w:hAnsi="Times New Roman"/>
+                <w:sz w:val="24"/>
+              </w:rPr>
+              <w:t>11</w:t>
+            </w:r>
+          </w:p>
+        </w:tc>
+        <w:tc>
+          <w:tcPr>
+            <w:tcW w:type="dxa" w:w="2160"/>
+            <w:vAlign w:val="center"/>
+          </w:tcPr>
+          <w:p>
+            <w:pPr>
+              <w:spacing w:line="276" w:lineRule="auto"/>
+              <w:jc w:val="center"/>
+            </w:pPr>
+            <w:r>
+              <w:rPr>
+                <w:rFonts w:ascii="Times New Roman" w:hAnsi="Times New Roman"/>
+                <w:sz w:val="24"/>
+              </w:rPr>
+              <w:t>09/02 – 15/02/2026</w:t>
+            </w:r>
+          </w:p>
+        </w:tc>
+        <w:tc>
+          <w:tcPr>
+            <w:tcW w:type="dxa" w:w="2160"/>
+            <w:vAlign w:val="top"/>
+          </w:tcPr>
+          <w:p>
+            <w:pPr>
+              <w:spacing w:line="276" w:lineRule="auto"/>
+              <w:jc w:val="both"/>
+            </w:pPr>
+            <w:r>
+              <w:rPr>
+                <w:rFonts w:ascii="Times New Roman" w:hAnsi="Times New Roman"/>
+                <w:sz w:val="24"/>
+              </w:rPr>
+              <w:t>Hoàn thành feedback đợt 1 submit lại, thiết kế độc lập module Enrollment Management, áp dụng tất cả kiến thức (DB/Screen/API/Batch), sử dụng Claude AI tự review, tổng hợp tài liệu theo chuẩn template</w:t>
+            </w:r>
+          </w:p>
+        </w:tc>
+        <w:tc>
+          <w:tcPr>
+            <w:tcW w:type="dxa" w:w="2160"/>
+            <w:vAlign w:val="top"/>
+          </w:tcPr>
+          <w:p>
+            <w:pPr>
+              <w:spacing w:line="276" w:lineRule="auto"/>
+              <w:jc w:val="both"/>
+            </w:pPr>
+            <w:r>
+              <w:rPr>
+                <w:rFonts w:ascii="Times New Roman" w:hAnsi="Times New Roman"/>
+                <w:sz w:val="24"/>
+              </w:rPr>
+              <w:t>Làm việc độc lập từ phân tích đến hoàn thiện thiết kế, tự kiểm tra chất lượng và phát hiện lỗi, time management đúng deadline. Hoàn thành Enrollment Management, pass review ngay lần đầu</w:t>
+            </w:r>
+          </w:p>
+        </w:tc>
+      </w:tr>
+      <w:tr>
+        <w:tc>
+          <w:tcPr>
+            <w:tcW w:type="dxa" w:w="2160"/>
+            <w:vAlign w:val="center"/>
+          </w:tcPr>
+          <w:p>
+            <w:pPr>
+              <w:spacing w:line="276" w:lineRule="auto"/>
+              <w:jc w:val="center"/>
+            </w:pPr>
+            <w:r>
+              <w:rPr>
+                <w:rFonts w:ascii="Times New Roman" w:hAnsi="Times New Roman"/>
+                <w:sz w:val="24"/>
+              </w:rPr>
+              <w:t>12</w:t>
+            </w:r>
+          </w:p>
+        </w:tc>
+        <w:tc>
+          <w:tcPr>
+            <w:tcW w:type="dxa" w:w="2160"/>
+            <w:vAlign w:val="center"/>
+          </w:tcPr>
+          <w:p>
+            <w:pPr>
+              <w:spacing w:line="276" w:lineRule="auto"/>
+              <w:jc w:val="center"/>
+            </w:pPr>
+            <w:r>
+              <w:rPr>
+                <w:rFonts w:ascii="Times New Roman" w:hAnsi="Times New Roman"/>
+                <w:sz w:val="24"/>
+              </w:rPr>
+              <w:t>16/02 – 22/02/2026</w:t>
+            </w:r>
+          </w:p>
+        </w:tc>
+        <w:tc>
+          <w:tcPr>
+            <w:tcW w:type="dxa" w:w="2160"/>
+            <w:vAlign w:val="top"/>
+          </w:tcPr>
+          <w:p>
+            <w:pPr>
+              <w:spacing w:line="276" w:lineRule="auto"/>
+              <w:jc w:val="both"/>
+            </w:pPr>
+            <w:r>
+              <w:rPr>
+                <w:rFonts w:ascii="Times New Roman" w:hAnsi="Times New Roman"/>
+                <w:sz w:val="24"/>
+              </w:rPr>
+              <w:t>Xử lý feedback đợt 2 từ Customer Review, tinh chỉnh theo góp ý khách hàng, kiểm tra cross-reference (DB↔API, Screen↔API), viết báo cáo thực tập, chuẩn bị tài liệu tổng hợp (ERD, API spec, Batch flow diagram)</w:t>
+            </w:r>
+          </w:p>
+        </w:tc>
+        <w:tc>
+          <w:tcPr>
+            <w:tcW w:type="dxa" w:w="2160"/>
+            <w:vAlign w:val="top"/>
+          </w:tcPr>
+          <w:p>
+            <w:pPr>
+              <w:spacing w:line="276" w:lineRule="auto"/>
+              <w:jc w:val="both"/>
+            </w:pPr>
+            <w:r>
+              <w:rPr>
+                <w:rFonts w:ascii="Times New Roman" w:hAnsi="Times New Roman"/>
+                <w:sz w:val="24"/>
+              </w:rPr>
+              <w:t>Communication với khách hàng qua tài liệu, tầm quan trọng cross-reference checking, viết báo cáo kỹ thuật chuẩn học thuật. Hoàn thành xử lý feedback đợt 2, bắt đầu báo cáo</w:t>
+            </w:r>
+          </w:p>
+        </w:tc>
+      </w:tr>
+      <w:tr>
+        <w:tc>
+          <w:tcPr>
+            <w:tcW w:type="dxa" w:w="2160"/>
+            <w:vAlign w:val="center"/>
+          </w:tcPr>
+          <w:p>
+            <w:pPr>
+              <w:spacing w:line="276" w:lineRule="auto"/>
+              <w:jc w:val="center"/>
+            </w:pPr>
+            <w:r>
+              <w:rPr>
+                <w:rFonts w:ascii="Times New Roman" w:hAnsi="Times New Roman"/>
+                <w:sz w:val="24"/>
+              </w:rPr>
+              <w:t>13</w:t>
+            </w:r>
+          </w:p>
+        </w:tc>
+        <w:tc>
+          <w:tcPr>
+            <w:tcW w:type="dxa" w:w="2160"/>
+            <w:vAlign w:val="center"/>
+          </w:tcPr>
+          <w:p>
+            <w:pPr>
+              <w:spacing w:line="276" w:lineRule="auto"/>
+              <w:jc w:val="center"/>
+            </w:pPr>
+            <w:r>
+              <w:rPr>
+                <w:rFonts w:ascii="Times New Roman" w:hAnsi="Times New Roman"/>
+                <w:sz w:val="24"/>
+              </w:rPr>
+              <w:t>23/02 – 01/03/2026</w:t>
+            </w:r>
+          </w:p>
+        </w:tc>
+        <w:tc>
+          <w:tcPr>
+            <w:tcW w:type="dxa" w:w="2160"/>
+            <w:vAlign w:val="top"/>
+          </w:tcPr>
+          <w:p>
+            <w:pPr>
+              <w:spacing w:line="276" w:lineRule="auto"/>
+              <w:jc w:val="both"/>
+            </w:pPr>
+            <w:r>
+              <w:rPr>
+                <w:rFonts w:ascii="Times New Roman" w:hAnsi="Times New Roman"/>
+                <w:sz w:val="24"/>
+              </w:rPr>
+              <w:t>Hoàn thiện tất cả tài liệu (DB/Screen/API/Batch), tạo tổng hợp (System Architecture, Database ERD, API Documentation), viết hoàn chỉnh báo cáo theo chuẩn UTC, chuẩn bị slide thuyết trình, nộp sản phẩm và nhận feedback tích cực</w:t>
+            </w:r>
+          </w:p>
+        </w:tc>
+        <w:tc>
+          <w:tcPr>
+            <w:tcW w:type="dxa" w:w="2160"/>
+            <w:vAlign w:val="top"/>
+          </w:tcPr>
+          <w:p>
+            <w:pPr>
+              <w:spacing w:line="276" w:lineRule="auto"/>
+              <w:jc w:val="both"/>
+            </w:pPr>
+            <w:r>
+              <w:rPr>
+                <w:rFonts w:ascii="Times New Roman" w:hAnsi="Times New Roman"/>
+                <w:sz w:val="24"/>
+              </w:rPr>
+              <w:t>Tổng hợp và trình bày kết quả, viết báo cáo kỹ thuật chuyên nghiệp, kỹ năng thuyết trình và communication. Hoàn thành đầy đủ sản phẩm, đánh giá cao từ mentor và công ty</w:t>
+            </w:r>
+          </w:p>
+        </w:tc>
+      </w:tr>
+    </w:tbl>
     <w:p/>
     <w:p>
       <w:pPr>

</xml_diff>